<commit_message>
docs(dotbiz/settlement): 경쟁사 PG 모델 벤치마크 추가 — TBO vs Ratehawk
대표이사 시장 조사 인풋 반영:

📊 경쟁사 패턴:
- TBO: 결제수수료 고객사 부담 (별도 청구)
- Ratehawk: 결제수수료 호텔 가격에 포함 (단일 가격)

🎯 권장 — 하이브리드 모델:
거래 유형/고객 규모별로 두 패턴 분기 적용
- Non-refundable + 소형 고객: Ratehawk 방식 (호텔 마진 활용)
- POSTPAY 카드 협의 + 대형 고객 (TTV 5억+): TBO 방식 (별도 청구)
- Free Cancel: 송금 우선 (PG 0%)

산출물:
- Settlement_CEO_Critical_Update_2026-05-08.md 갱신
- Settlement_CEO_Critical_Update_2026-05-08.docx 재생성
- POLICY_CHANGELOG 1건 추가 (총 30건)

후속 작업:
- TBO/Ratehawk 가격표 상세 입수
- 대형 고객사 5곳 인터뷰
- 정량 분석 (수용도/표시가 영향)

Co-Authored-By: Claude Opus 4.7 (1M context) <noreply@anthropic.com>
</commit_message>
<xml_diff>
--- a/docs/Settlement_CEO_Critical_Update_2026-05-08.docx
+++ b/docs/Settlement_CEO_Critical_Update_2026-05-08.docx
@@ -6671,6 +6671,2407 @@
           <w:szCs w:val="20"/>
         </w:rPr>
         <w:t xml:space="preserve">: CFO + 기획 + 보안 담당</w:t>
+      </w:r>
+    </w:p>
+    <w:p>
+      <w:r>
+        <w:t xml:space="preserve"/>
+      </w:r>
+    </w:p>
+    <w:p>
+      <w:pPr>
+        <w:pBdr>
+          <w:bottom w:val="single" w:color="999999" w:sz="6" w:space="1"/>
+        </w:pBdr>
+        <w:spacing w:after="100" w:before="100"/>
+      </w:pPr>
+      <w:r>
+        <w:t xml:space="preserve"/>
+      </w:r>
+    </w:p>
+    <w:p>
+      <w:r>
+        <w:t xml:space="preserve"/>
+      </w:r>
+    </w:p>
+    <w:p>
+      <w:pPr>
+        <w:pStyle w:val="Heading2"/>
+        <w:spacing w:after="150" w:before="300"/>
+      </w:pPr>
+      <w:r>
+        <w:rPr>
+          <w:rFonts w:ascii="Malgun Gothic" w:cs="Malgun Gothic" w:eastAsia="Malgun Gothic" w:hAnsi="Malgun Gothic"/>
+          <w:b/>
+          <w:bCs/>
+          <w:sz w:val="30"/>
+          <w:szCs w:val="30"/>
+        </w:rPr>
+        <w:t xml:space="preserve">🔍 경쟁사 PG 모델 벤치마크 (Market Research)</w:t>
+      </w:r>
+    </w:p>
+    <w:p>
+      <w:r>
+        <w:t xml:space="preserve"/>
+      </w:r>
+    </w:p>
+    <w:p>
+      <w:pPr>
+        <w:pStyle w:val="Heading3"/>
+        <w:spacing w:after="120" w:before="240"/>
+      </w:pPr>
+      <w:r>
+        <w:rPr>
+          <w:rFonts w:ascii="Malgun Gothic" w:cs="Malgun Gothic" w:eastAsia="Malgun Gothic" w:hAnsi="Malgun Gothic"/>
+          <w:b/>
+          <w:bCs/>
+          <w:sz w:val="26"/>
+          <w:szCs w:val="26"/>
+        </w:rPr>
+        <w:t xml:space="preserve">대표이사 시장 조사 인풋</w:t>
+      </w:r>
+    </w:p>
+    <w:p>
+      <w:r>
+        <w:t xml:space="preserve"/>
+      </w:r>
+    </w:p>
+    <w:p>
+      <w:pPr>
+        <w:spacing w:after="80"/>
+      </w:pPr>
+      <w:r>
+        <w:rPr>
+          <w:rFonts w:ascii="Malgun Gothic" w:cs="Malgun Gothic" w:eastAsia="Malgun Gothic" w:hAnsi="Malgun Gothic"/>
+          <w:sz w:val="20"/>
+          <w:szCs w:val="20"/>
+        </w:rPr>
+        <w:t xml:space="preserve">많은 B2B 공급사들이 소규모 업체용 시스템(DOTBIZ 유사)을 통해 고객사 결제를 받고 있음. 그중 두 거대 공급사가 </w:t>
+      </w:r>
+      <w:r>
+        <w:rPr>
+          <w:rFonts w:ascii="Malgun Gothic" w:cs="Malgun Gothic" w:eastAsia="Malgun Gothic" w:hAnsi="Malgun Gothic"/>
+          <w:b/>
+          <w:bCs/>
+          <w:sz w:val="20"/>
+          <w:szCs w:val="20"/>
+        </w:rPr>
+        <w:t xml:space="preserve">서로 다른 모델</w:t>
+      </w:r>
+      <w:r>
+        <w:rPr>
+          <w:rFonts w:ascii="Malgun Gothic" w:cs="Malgun Gothic" w:eastAsia="Malgun Gothic" w:hAnsi="Malgun Gothic"/>
+          <w:sz w:val="20"/>
+          <w:szCs w:val="20"/>
+        </w:rPr>
+        <w:t xml:space="preserve">을 사용:</w:t>
+      </w:r>
+    </w:p>
+    <w:p>
+      <w:r>
+        <w:t xml:space="preserve"/>
+      </w:r>
+    </w:p>
+    <w:tbl>
+      <w:tblPr>
+        <w:tblW w:type="dxa" w:w="9360"/>
+        <w:tblBorders>
+          <w:top w:val="single" w:color="auto" w:sz="4"/>
+          <w:left w:val="single" w:color="auto" w:sz="4"/>
+          <w:bottom w:val="single" w:color="auto" w:sz="4"/>
+          <w:right w:val="single" w:color="auto" w:sz="4"/>
+          <w:insideH w:val="single" w:color="auto" w:sz="4"/>
+          <w:insideV w:val="single" w:color="auto" w:sz="4"/>
+        </w:tblBorders>
+      </w:tblPr>
+      <w:tblGrid>
+        <w:gridCol w:w="2340"/>
+        <w:gridCol w:w="2340"/>
+        <w:gridCol w:w="2340"/>
+        <w:gridCol w:w="2340"/>
+      </w:tblGrid>
+      <w:tr>
+        <w:trPr>
+          <w:tblHeader/>
+        </w:trPr>
+        <w:tc>
+          <w:tcPr>
+            <w:tcW w:type="dxa" w:w="2340"/>
+            <w:tcBorders>
+              <w:top w:val="single" w:color="BFBFBF" w:sz="4"/>
+              <w:left w:val="single" w:color="BFBFBF" w:sz="4"/>
+              <w:bottom w:val="single" w:color="BFBFBF" w:sz="4"/>
+              <w:right w:val="single" w:color="BFBFBF" w:sz="4"/>
+            </w:tcBorders>
+            <w:shd w:fill="D5E8F0" w:val="clear"/>
+            <w:tcMar>
+              <w:top w:type="dxa" w:w="80"/>
+              <w:left w:type="dxa" w:w="120"/>
+              <w:bottom w:type="dxa" w:w="80"/>
+              <w:right w:type="dxa" w:w="120"/>
+            </w:tcMar>
+          </w:tcPr>
+          <w:p>
+            <w:r>
+              <w:rPr>
+                <w:b/>
+                <w:bCs/>
+              </w:rPr>
+            </w:r>
+          </w:p>
+        </w:tc>
+        <w:tc>
+          <w:tcPr>
+            <w:tcW w:type="dxa" w:w="2340"/>
+            <w:tcBorders>
+              <w:top w:val="single" w:color="BFBFBF" w:sz="4"/>
+              <w:left w:val="single" w:color="BFBFBF" w:sz="4"/>
+              <w:bottom w:val="single" w:color="BFBFBF" w:sz="4"/>
+              <w:right w:val="single" w:color="BFBFBF" w:sz="4"/>
+            </w:tcBorders>
+            <w:shd w:fill="D5E8F0" w:val="clear"/>
+            <w:tcMar>
+              <w:top w:type="dxa" w:w="80"/>
+              <w:left w:type="dxa" w:w="120"/>
+              <w:bottom w:type="dxa" w:w="80"/>
+              <w:right w:type="dxa" w:w="120"/>
+            </w:tcMar>
+          </w:tcPr>
+          <w:p>
+            <w:r>
+              <w:rPr>
+                <w:b/>
+                <w:bCs/>
+              </w:rPr>
+            </w:r>
+          </w:p>
+        </w:tc>
+        <w:tc>
+          <w:tcPr>
+            <w:tcW w:type="dxa" w:w="2340"/>
+            <w:tcBorders>
+              <w:top w:val="single" w:color="BFBFBF" w:sz="4"/>
+              <w:left w:val="single" w:color="BFBFBF" w:sz="4"/>
+              <w:bottom w:val="single" w:color="BFBFBF" w:sz="4"/>
+              <w:right w:val="single" w:color="BFBFBF" w:sz="4"/>
+            </w:tcBorders>
+            <w:shd w:fill="D5E8F0" w:val="clear"/>
+            <w:tcMar>
+              <w:top w:type="dxa" w:w="80"/>
+              <w:left w:type="dxa" w:w="120"/>
+              <w:bottom w:type="dxa" w:w="80"/>
+              <w:right w:type="dxa" w:w="120"/>
+            </w:tcMar>
+          </w:tcPr>
+          <w:p>
+            <w:r>
+              <w:rPr>
+                <w:b/>
+                <w:bCs/>
+              </w:rPr>
+            </w:r>
+          </w:p>
+        </w:tc>
+        <w:tc>
+          <w:tcPr>
+            <w:tcW w:type="dxa" w:w="2340"/>
+            <w:tcBorders>
+              <w:top w:val="single" w:color="BFBFBF" w:sz="4"/>
+              <w:left w:val="single" w:color="BFBFBF" w:sz="4"/>
+              <w:bottom w:val="single" w:color="BFBFBF" w:sz="4"/>
+              <w:right w:val="single" w:color="BFBFBF" w:sz="4"/>
+            </w:tcBorders>
+            <w:shd w:fill="D5E8F0" w:val="clear"/>
+            <w:tcMar>
+              <w:top w:type="dxa" w:w="80"/>
+              <w:left w:type="dxa" w:w="120"/>
+              <w:bottom w:type="dxa" w:w="80"/>
+              <w:right w:type="dxa" w:w="120"/>
+            </w:tcMar>
+          </w:tcPr>
+          <w:p>
+            <w:r>
+              <w:rPr>
+                <w:b/>
+                <w:bCs/>
+              </w:rPr>
+            </w:r>
+          </w:p>
+        </w:tc>
+      </w:tr>
+      <w:tr>
+        <w:tc>
+          <w:tcPr>
+            <w:tcW w:type="dxa" w:w="2340"/>
+            <w:tcBorders>
+              <w:top w:val="single" w:color="BFBFBF" w:sz="4"/>
+              <w:left w:val="single" w:color="BFBFBF" w:sz="4"/>
+              <w:bottom w:val="single" w:color="BFBFBF" w:sz="4"/>
+              <w:right w:val="single" w:color="BFBFBF" w:sz="4"/>
+            </w:tcBorders>
+            <w:tcMar>
+              <w:top w:type="dxa" w:w="80"/>
+              <w:left w:type="dxa" w:w="120"/>
+              <w:bottom w:type="dxa" w:w="80"/>
+              <w:right w:type="dxa" w:w="120"/>
+            </w:tcMar>
+          </w:tcPr>
+          <w:p>
+            <w:r>
+              <w:rPr>
+                <w:rFonts w:ascii="Malgun Gothic" w:cs="Malgun Gothic" w:eastAsia="Malgun Gothic" w:hAnsi="Malgun Gothic"/>
+                <w:b/>
+                <w:bCs/>
+                <w:sz w:val="20"/>
+                <w:szCs w:val="20"/>
+              </w:rPr>
+              <w:t xml:space="preserve">TBO</w:t>
+            </w:r>
+          </w:p>
+        </w:tc>
+        <w:tc>
+          <w:tcPr>
+            <w:tcW w:type="dxa" w:w="2340"/>
+            <w:tcBorders>
+              <w:top w:val="single" w:color="BFBFBF" w:sz="4"/>
+              <w:left w:val="single" w:color="BFBFBF" w:sz="4"/>
+              <w:bottom w:val="single" w:color="BFBFBF" w:sz="4"/>
+              <w:right w:val="single" w:color="BFBFBF" w:sz="4"/>
+            </w:tcBorders>
+            <w:tcMar>
+              <w:top w:type="dxa" w:w="80"/>
+              <w:left w:type="dxa" w:w="120"/>
+              <w:bottom w:type="dxa" w:w="80"/>
+              <w:right w:type="dxa" w:w="120"/>
+            </w:tcMar>
+          </w:tcPr>
+          <w:p>
+            <w:r>
+              <w:rPr>
+                <w:rFonts w:ascii="Malgun Gothic" w:cs="Malgun Gothic" w:eastAsia="Malgun Gothic" w:hAnsi="Malgun Gothic"/>
+                <w:sz w:val="20"/>
+                <w:szCs w:val="20"/>
+              </w:rPr>
+              <w:t xml:space="preserve">외부 청구 모델</w:t>
+            </w:r>
+          </w:p>
+        </w:tc>
+        <w:tc>
+          <w:tcPr>
+            <w:tcW w:type="dxa" w:w="2340"/>
+            <w:tcBorders>
+              <w:top w:val="single" w:color="BFBFBF" w:sz="4"/>
+              <w:left w:val="single" w:color="BFBFBF" w:sz="4"/>
+              <w:bottom w:val="single" w:color="BFBFBF" w:sz="4"/>
+              <w:right w:val="single" w:color="BFBFBF" w:sz="4"/>
+            </w:tcBorders>
+            <w:tcMar>
+              <w:top w:type="dxa" w:w="80"/>
+              <w:left w:type="dxa" w:w="120"/>
+              <w:bottom w:type="dxa" w:w="80"/>
+              <w:right w:type="dxa" w:w="120"/>
+            </w:tcMar>
+          </w:tcPr>
+          <w:p>
+            <w:r>
+              <w:rPr>
+                <w:rFonts w:ascii="Malgun Gothic" w:cs="Malgun Gothic" w:eastAsia="Malgun Gothic" w:hAnsi="Malgun Gothic"/>
+                <w:b/>
+                <w:bCs/>
+                <w:sz w:val="20"/>
+                <w:szCs w:val="20"/>
+              </w:rPr>
+              <w:t xml:space="preserve">고객사가 직접 부담</w:t>
+            </w:r>
+            <w:r>
+              <w:rPr>
+                <w:rFonts w:ascii="Malgun Gothic" w:cs="Malgun Gothic" w:eastAsia="Malgun Gothic" w:hAnsi="Malgun Gothic"/>
+                <w:sz w:val="20"/>
+                <w:szCs w:val="20"/>
+              </w:rPr>
+              <w:t xml:space="preserve"> (별도 청구)</w:t>
+            </w:r>
+          </w:p>
+        </w:tc>
+        <w:tc>
+          <w:tcPr>
+            <w:tcW w:type="dxa" w:w="2340"/>
+            <w:tcBorders>
+              <w:top w:val="single" w:color="BFBFBF" w:sz="4"/>
+              <w:left w:val="single" w:color="BFBFBF" w:sz="4"/>
+              <w:bottom w:val="single" w:color="BFBFBF" w:sz="4"/>
+              <w:right w:val="single" w:color="BFBFBF" w:sz="4"/>
+            </w:tcBorders>
+            <w:tcMar>
+              <w:top w:type="dxa" w:w="80"/>
+              <w:left w:type="dxa" w:w="120"/>
+              <w:bottom w:type="dxa" w:w="80"/>
+              <w:right w:type="dxa" w:w="120"/>
+            </w:tcMar>
+          </w:tcPr>
+          <w:p>
+            <w:r>
+              <w:rPr>
+                <w:rFonts w:ascii="Malgun Gothic" w:cs="Malgun Gothic" w:eastAsia="Malgun Gothic" w:hAnsi="Malgun Gothic"/>
+                <w:sz w:val="20"/>
+                <w:szCs w:val="20"/>
+              </w:rPr>
+              <w:t xml:space="preserve">호텔 정가 + 결제수수료 별도</w:t>
+            </w:r>
+          </w:p>
+        </w:tc>
+      </w:tr>
+      <w:tr>
+        <w:tc>
+          <w:tcPr>
+            <w:tcW w:type="dxa" w:w="2340"/>
+            <w:tcBorders>
+              <w:top w:val="single" w:color="BFBFBF" w:sz="4"/>
+              <w:left w:val="single" w:color="BFBFBF" w:sz="4"/>
+              <w:bottom w:val="single" w:color="BFBFBF" w:sz="4"/>
+              <w:right w:val="single" w:color="BFBFBF" w:sz="4"/>
+            </w:tcBorders>
+            <w:tcMar>
+              <w:top w:type="dxa" w:w="80"/>
+              <w:left w:type="dxa" w:w="120"/>
+              <w:bottom w:type="dxa" w:w="80"/>
+              <w:right w:type="dxa" w:w="120"/>
+            </w:tcMar>
+          </w:tcPr>
+          <w:p>
+            <w:r>
+              <w:rPr>
+                <w:rFonts w:ascii="Malgun Gothic" w:cs="Malgun Gothic" w:eastAsia="Malgun Gothic" w:hAnsi="Malgun Gothic"/>
+                <w:b/>
+                <w:bCs/>
+                <w:sz w:val="20"/>
+                <w:szCs w:val="20"/>
+              </w:rPr>
+              <w:t xml:space="preserve">Ratehawk</w:t>
+            </w:r>
+          </w:p>
+        </w:tc>
+        <w:tc>
+          <w:tcPr>
+            <w:tcW w:type="dxa" w:w="2340"/>
+            <w:tcBorders>
+              <w:top w:val="single" w:color="BFBFBF" w:sz="4"/>
+              <w:left w:val="single" w:color="BFBFBF" w:sz="4"/>
+              <w:bottom w:val="single" w:color="BFBFBF" w:sz="4"/>
+              <w:right w:val="single" w:color="BFBFBF" w:sz="4"/>
+            </w:tcBorders>
+            <w:tcMar>
+              <w:top w:type="dxa" w:w="80"/>
+              <w:left w:type="dxa" w:w="120"/>
+              <w:bottom w:type="dxa" w:w="80"/>
+              <w:right w:type="dxa" w:w="120"/>
+            </w:tcMar>
+          </w:tcPr>
+          <w:p>
+            <w:r>
+              <w:rPr>
+                <w:rFonts w:ascii="Malgun Gothic" w:cs="Malgun Gothic" w:eastAsia="Malgun Gothic" w:hAnsi="Malgun Gothic"/>
+                <w:sz w:val="20"/>
+                <w:szCs w:val="20"/>
+              </w:rPr>
+              <w:t xml:space="preserve">가격 포함 모델</w:t>
+            </w:r>
+          </w:p>
+        </w:tc>
+        <w:tc>
+          <w:tcPr>
+            <w:tcW w:type="dxa" w:w="2340"/>
+            <w:tcBorders>
+              <w:top w:val="single" w:color="BFBFBF" w:sz="4"/>
+              <w:left w:val="single" w:color="BFBFBF" w:sz="4"/>
+              <w:bottom w:val="single" w:color="BFBFBF" w:sz="4"/>
+              <w:right w:val="single" w:color="BFBFBF" w:sz="4"/>
+            </w:tcBorders>
+            <w:tcMar>
+              <w:top w:type="dxa" w:w="80"/>
+              <w:left w:type="dxa" w:w="120"/>
+              <w:bottom w:type="dxa" w:w="80"/>
+              <w:right w:type="dxa" w:w="120"/>
+            </w:tcMar>
+          </w:tcPr>
+          <w:p>
+            <w:r>
+              <w:rPr>
+                <w:rFonts w:ascii="Malgun Gothic" w:cs="Malgun Gothic" w:eastAsia="Malgun Gothic" w:hAnsi="Malgun Gothic"/>
+                <w:b/>
+                <w:bCs/>
+                <w:sz w:val="20"/>
+                <w:szCs w:val="20"/>
+              </w:rPr>
+              <w:t xml:space="preserve">호텔 가격에 포함</w:t>
+            </w:r>
+          </w:p>
+        </w:tc>
+        <w:tc>
+          <w:tcPr>
+            <w:tcW w:type="dxa" w:w="2340"/>
+            <w:tcBorders>
+              <w:top w:val="single" w:color="BFBFBF" w:sz="4"/>
+              <w:left w:val="single" w:color="BFBFBF" w:sz="4"/>
+              <w:bottom w:val="single" w:color="BFBFBF" w:sz="4"/>
+              <w:right w:val="single" w:color="BFBFBF" w:sz="4"/>
+            </w:tcBorders>
+            <w:tcMar>
+              <w:top w:type="dxa" w:w="80"/>
+              <w:left w:type="dxa" w:w="120"/>
+              <w:bottom w:type="dxa" w:w="80"/>
+              <w:right w:type="dxa" w:w="120"/>
+            </w:tcMar>
+          </w:tcPr>
+          <w:p>
+            <w:r>
+              <w:rPr>
+                <w:rFonts w:ascii="Malgun Gothic" w:cs="Malgun Gothic" w:eastAsia="Malgun Gothic" w:hAnsi="Malgun Gothic"/>
+                <w:sz w:val="20"/>
+                <w:szCs w:val="20"/>
+              </w:rPr>
+              <w:t xml:space="preserve">결제수수료 포함 단일 가격</w:t>
+            </w:r>
+          </w:p>
+        </w:tc>
+      </w:tr>
+      <w:tr>
+        <w:tc>
+          <w:tcPr>
+            <w:tcW w:type="dxa" w:w="2340"/>
+            <w:tcBorders>
+              <w:top w:val="single" w:color="BFBFBF" w:sz="4"/>
+              <w:left w:val="single" w:color="BFBFBF" w:sz="4"/>
+              <w:bottom w:val="single" w:color="BFBFBF" w:sz="4"/>
+              <w:right w:val="single" w:color="BFBFBF" w:sz="4"/>
+            </w:tcBorders>
+            <w:tcMar>
+              <w:top w:type="dxa" w:w="80"/>
+              <w:left w:type="dxa" w:w="120"/>
+              <w:bottom w:type="dxa" w:w="80"/>
+              <w:right w:type="dxa" w:w="120"/>
+            </w:tcMar>
+          </w:tcPr>
+          <w:p>
+            <w:r>
+              <w:rPr>
+                <w:rFonts w:ascii="Malgun Gothic" w:cs="Malgun Gothic" w:eastAsia="Malgun Gothic" w:hAnsi="Malgun Gothic"/>
+                <w:b/>
+                <w:bCs/>
+                <w:sz w:val="20"/>
+                <w:szCs w:val="20"/>
+              </w:rPr>
+              <w:t xml:space="preserve">DOTBIZ 현재 결정</w:t>
+            </w:r>
+          </w:p>
+        </w:tc>
+        <w:tc>
+          <w:tcPr>
+            <w:tcW w:type="dxa" w:w="2340"/>
+            <w:tcBorders>
+              <w:top w:val="single" w:color="BFBFBF" w:sz="4"/>
+              <w:left w:val="single" w:color="BFBFBF" w:sz="4"/>
+              <w:bottom w:val="single" w:color="BFBFBF" w:sz="4"/>
+              <w:right w:val="single" w:color="BFBFBF" w:sz="4"/>
+            </w:tcBorders>
+            <w:tcMar>
+              <w:top w:type="dxa" w:w="80"/>
+              <w:left w:type="dxa" w:w="120"/>
+              <w:bottom w:type="dxa" w:w="80"/>
+              <w:right w:type="dxa" w:w="120"/>
+            </w:tcMar>
+          </w:tcPr>
+          <w:p>
+            <w:r>
+              <w:rPr>
+                <w:rFonts w:ascii="Malgun Gothic" w:cs="Malgun Gothic" w:eastAsia="Malgun Gothic" w:hAnsi="Malgun Gothic"/>
+                <w:sz w:val="20"/>
+                <w:szCs w:val="20"/>
+              </w:rPr>
+              <w:t xml:space="preserve">DOTBIZ 흡수 + 마진 반영</w:t>
+            </w:r>
+          </w:p>
+        </w:tc>
+        <w:tc>
+          <w:tcPr>
+            <w:tcW w:type="dxa" w:w="2340"/>
+            <w:tcBorders>
+              <w:top w:val="single" w:color="BFBFBF" w:sz="4"/>
+              <w:left w:val="single" w:color="BFBFBF" w:sz="4"/>
+              <w:bottom w:val="single" w:color="BFBFBF" w:sz="4"/>
+              <w:right w:val="single" w:color="BFBFBF" w:sz="4"/>
+            </w:tcBorders>
+            <w:tcMar>
+              <w:top w:type="dxa" w:w="80"/>
+              <w:left w:type="dxa" w:w="120"/>
+              <w:bottom w:type="dxa" w:w="80"/>
+              <w:right w:type="dxa" w:w="120"/>
+            </w:tcMar>
+          </w:tcPr>
+          <w:p>
+            <w:r>
+              <w:rPr>
+                <w:rFonts w:ascii="Malgun Gothic" w:cs="Malgun Gothic" w:eastAsia="Malgun Gothic" w:hAnsi="Malgun Gothic"/>
+                <w:sz w:val="20"/>
+                <w:szCs w:val="20"/>
+              </w:rPr>
+              <w:t xml:space="preserve">DOTBIZ 흡수</w:t>
+            </w:r>
+          </w:p>
+        </w:tc>
+        <w:tc>
+          <w:tcPr>
+            <w:tcW w:type="dxa" w:w="2340"/>
+            <w:tcBorders>
+              <w:top w:val="single" w:color="BFBFBF" w:sz="4"/>
+              <w:left w:val="single" w:color="BFBFBF" w:sz="4"/>
+              <w:bottom w:val="single" w:color="BFBFBF" w:sz="4"/>
+              <w:right w:val="single" w:color="BFBFBF" w:sz="4"/>
+            </w:tcBorders>
+            <w:tcMar>
+              <w:top w:type="dxa" w:w="80"/>
+              <w:left w:type="dxa" w:w="120"/>
+              <w:bottom w:type="dxa" w:w="80"/>
+              <w:right w:type="dxa" w:w="120"/>
+            </w:tcMar>
+          </w:tcPr>
+          <w:p>
+            <w:r>
+              <w:rPr>
+                <w:rFonts w:ascii="Malgun Gothic" w:cs="Malgun Gothic" w:eastAsia="Malgun Gothic" w:hAnsi="Malgun Gothic"/>
+                <w:sz w:val="20"/>
+                <w:szCs w:val="20"/>
+              </w:rPr>
+              <w:t xml:space="preserve">가격에 반영 (Ratehawk 유사)</w:t>
+            </w:r>
+          </w:p>
+        </w:tc>
+      </w:tr>
+    </w:tbl>
+    <w:p>
+      <w:r>
+        <w:t xml:space="preserve"/>
+      </w:r>
+    </w:p>
+    <w:p>
+      <w:r>
+        <w:t xml:space="preserve"/>
+      </w:r>
+    </w:p>
+    <w:p>
+      <w:pPr>
+        <w:pStyle w:val="Heading3"/>
+        <w:spacing w:after="120" w:before="240"/>
+      </w:pPr>
+      <w:r>
+        <w:rPr>
+          <w:rFonts w:ascii="Malgun Gothic" w:cs="Malgun Gothic" w:eastAsia="Malgun Gothic" w:hAnsi="Malgun Gothic"/>
+          <w:b/>
+          <w:bCs/>
+          <w:sz w:val="26"/>
+          <w:szCs w:val="26"/>
+        </w:rPr>
+        <w:t xml:space="preserve">두 모델 비교</w:t>
+      </w:r>
+    </w:p>
+    <w:p>
+      <w:r>
+        <w:t xml:space="preserve"/>
+      </w:r>
+    </w:p>
+    <w:p>
+      <w:pPr>
+        <w:pStyle w:val="Heading4"/>
+        <w:spacing w:after="100" w:before="200"/>
+      </w:pPr>
+      <w:r>
+        <w:rPr>
+          <w:rFonts w:ascii="Malgun Gothic" w:cs="Malgun Gothic" w:eastAsia="Malgun Gothic" w:hAnsi="Malgun Gothic"/>
+          <w:b/>
+          <w:bCs/>
+          <w:sz w:val="22"/>
+          <w:szCs w:val="22"/>
+        </w:rPr>
+        <w:t xml:space="preserve">TBO 방식 (고객사 부담)</w:t>
+      </w:r>
+    </w:p>
+    <w:p>
+      <w:r>
+        <w:t xml:space="preserve"/>
+      </w:r>
+    </w:p>
+    <w:tbl>
+      <w:tblPr>
+        <w:tblW w:type="dxa" w:w="9360"/>
+        <w:tblBorders>
+          <w:top w:val="single" w:color="auto" w:sz="4"/>
+          <w:left w:val="single" w:color="auto" w:sz="4"/>
+          <w:bottom w:val="single" w:color="auto" w:sz="4"/>
+          <w:right w:val="single" w:color="auto" w:sz="4"/>
+          <w:insideH w:val="single" w:color="auto" w:sz="4"/>
+          <w:insideV w:val="single" w:color="auto" w:sz="4"/>
+        </w:tblBorders>
+      </w:tblPr>
+      <w:tblGrid>
+        <w:gridCol w:w="4680"/>
+        <w:gridCol w:w="4680"/>
+      </w:tblGrid>
+      <w:tr>
+        <w:trPr>
+          <w:tblHeader/>
+        </w:trPr>
+        <w:tc>
+          <w:tcPr>
+            <w:tcW w:type="dxa" w:w="4680"/>
+            <w:tcBorders>
+              <w:top w:val="single" w:color="BFBFBF" w:sz="4"/>
+              <w:left w:val="single" w:color="BFBFBF" w:sz="4"/>
+              <w:bottom w:val="single" w:color="BFBFBF" w:sz="4"/>
+              <w:right w:val="single" w:color="BFBFBF" w:sz="4"/>
+            </w:tcBorders>
+            <w:shd w:fill="D5E8F0" w:val="clear"/>
+            <w:tcMar>
+              <w:top w:type="dxa" w:w="80"/>
+              <w:left w:type="dxa" w:w="120"/>
+              <w:bottom w:type="dxa" w:w="80"/>
+              <w:right w:type="dxa" w:w="120"/>
+            </w:tcMar>
+          </w:tcPr>
+          <w:p>
+            <w:r>
+              <w:rPr>
+                <w:b/>
+                <w:bCs/>
+              </w:rPr>
+            </w:r>
+          </w:p>
+        </w:tc>
+        <w:tc>
+          <w:tcPr>
+            <w:tcW w:type="dxa" w:w="4680"/>
+            <w:tcBorders>
+              <w:top w:val="single" w:color="BFBFBF" w:sz="4"/>
+              <w:left w:val="single" w:color="BFBFBF" w:sz="4"/>
+              <w:bottom w:val="single" w:color="BFBFBF" w:sz="4"/>
+              <w:right w:val="single" w:color="BFBFBF" w:sz="4"/>
+            </w:tcBorders>
+            <w:shd w:fill="D5E8F0" w:val="clear"/>
+            <w:tcMar>
+              <w:top w:type="dxa" w:w="80"/>
+              <w:left w:type="dxa" w:w="120"/>
+              <w:bottom w:type="dxa" w:w="80"/>
+              <w:right w:type="dxa" w:w="120"/>
+            </w:tcMar>
+          </w:tcPr>
+          <w:p>
+            <w:r>
+              <w:rPr>
+                <w:b/>
+                <w:bCs/>
+              </w:rPr>
+            </w:r>
+          </w:p>
+        </w:tc>
+      </w:tr>
+      <w:tr>
+        <w:tc>
+          <w:tcPr>
+            <w:tcW w:type="dxa" w:w="4680"/>
+            <w:tcBorders>
+              <w:top w:val="single" w:color="BFBFBF" w:sz="4"/>
+              <w:left w:val="single" w:color="BFBFBF" w:sz="4"/>
+              <w:bottom w:val="single" w:color="BFBFBF" w:sz="4"/>
+              <w:right w:val="single" w:color="BFBFBF" w:sz="4"/>
+            </w:tcBorders>
+            <w:tcMar>
+              <w:top w:type="dxa" w:w="80"/>
+              <w:left w:type="dxa" w:w="120"/>
+              <w:bottom w:type="dxa" w:w="80"/>
+              <w:right w:type="dxa" w:w="120"/>
+            </w:tcMar>
+          </w:tcPr>
+          <w:p>
+            <w:r>
+              <w:rPr>
+                <w:rFonts w:ascii="Malgun Gothic" w:cs="Malgun Gothic" w:eastAsia="Malgun Gothic" w:hAnsi="Malgun Gothic"/>
+                <w:b/>
+                <w:bCs/>
+                <w:sz w:val="20"/>
+                <w:szCs w:val="20"/>
+              </w:rPr>
+              <w:t xml:space="preserve">DOTBIZ 마진</w:t>
+            </w:r>
+          </w:p>
+        </w:tc>
+        <w:tc>
+          <w:tcPr>
+            <w:tcW w:type="dxa" w:w="4680"/>
+            <w:tcBorders>
+              <w:top w:val="single" w:color="BFBFBF" w:sz="4"/>
+              <w:left w:val="single" w:color="BFBFBF" w:sz="4"/>
+              <w:bottom w:val="single" w:color="BFBFBF" w:sz="4"/>
+              <w:right w:val="single" w:color="BFBFBF" w:sz="4"/>
+            </w:tcBorders>
+            <w:tcMar>
+              <w:top w:type="dxa" w:w="80"/>
+              <w:left w:type="dxa" w:w="120"/>
+              <w:bottom w:type="dxa" w:w="80"/>
+              <w:right w:type="dxa" w:w="120"/>
+            </w:tcMar>
+          </w:tcPr>
+          <w:p>
+            <w:r>
+              <w:rPr>
+                <w:rFonts w:ascii="Malgun Gothic" w:cs="Malgun Gothic" w:eastAsia="Malgun Gothic" w:hAnsi="Malgun Gothic"/>
+                <w:sz w:val="20"/>
+                <w:szCs w:val="20"/>
+              </w:rPr>
+              <w:t xml:space="preserve">✅ 안전 (PG 0% 흡수)</w:t>
+            </w:r>
+          </w:p>
+        </w:tc>
+      </w:tr>
+      <w:tr>
+        <w:tc>
+          <w:tcPr>
+            <w:tcW w:type="dxa" w:w="4680"/>
+            <w:tcBorders>
+              <w:top w:val="single" w:color="BFBFBF" w:sz="4"/>
+              <w:left w:val="single" w:color="BFBFBF" w:sz="4"/>
+              <w:bottom w:val="single" w:color="BFBFBF" w:sz="4"/>
+              <w:right w:val="single" w:color="BFBFBF" w:sz="4"/>
+            </w:tcBorders>
+            <w:tcMar>
+              <w:top w:type="dxa" w:w="80"/>
+              <w:left w:type="dxa" w:w="120"/>
+              <w:bottom w:type="dxa" w:w="80"/>
+              <w:right w:type="dxa" w:w="120"/>
+            </w:tcMar>
+          </w:tcPr>
+          <w:p>
+            <w:r>
+              <w:rPr>
+                <w:rFonts w:ascii="Malgun Gothic" w:cs="Malgun Gothic" w:eastAsia="Malgun Gothic" w:hAnsi="Malgun Gothic"/>
+                <w:b/>
+                <w:bCs/>
+                <w:sz w:val="20"/>
+                <w:szCs w:val="20"/>
+              </w:rPr>
+              <w:t xml:space="preserve">고객 인식</w:t>
+            </w:r>
+          </w:p>
+        </w:tc>
+        <w:tc>
+          <w:tcPr>
+            <w:tcW w:type="dxa" w:w="4680"/>
+            <w:tcBorders>
+              <w:top w:val="single" w:color="BFBFBF" w:sz="4"/>
+              <w:left w:val="single" w:color="BFBFBF" w:sz="4"/>
+              <w:bottom w:val="single" w:color="BFBFBF" w:sz="4"/>
+              <w:right w:val="single" w:color="BFBFBF" w:sz="4"/>
+            </w:tcBorders>
+            <w:tcMar>
+              <w:top w:type="dxa" w:w="80"/>
+              <w:left w:type="dxa" w:w="120"/>
+              <w:bottom w:type="dxa" w:w="80"/>
+              <w:right w:type="dxa" w:w="120"/>
+            </w:tcMar>
+          </w:tcPr>
+          <w:p>
+            <w:r>
+              <w:rPr>
+                <w:rFonts w:ascii="Malgun Gothic" w:cs="Malgun Gothic" w:eastAsia="Malgun Gothic" w:hAnsi="Malgun Gothic"/>
+                <w:sz w:val="20"/>
+                <w:szCs w:val="20"/>
+              </w:rPr>
+              <w:t xml:space="preserve">⚠️ 추가 비용 명시 (불만 가능)</w:t>
+            </w:r>
+          </w:p>
+        </w:tc>
+      </w:tr>
+      <w:tr>
+        <w:tc>
+          <w:tcPr>
+            <w:tcW w:type="dxa" w:w="4680"/>
+            <w:tcBorders>
+              <w:top w:val="single" w:color="BFBFBF" w:sz="4"/>
+              <w:left w:val="single" w:color="BFBFBF" w:sz="4"/>
+              <w:bottom w:val="single" w:color="BFBFBF" w:sz="4"/>
+              <w:right w:val="single" w:color="BFBFBF" w:sz="4"/>
+            </w:tcBorders>
+            <w:tcMar>
+              <w:top w:type="dxa" w:w="80"/>
+              <w:left w:type="dxa" w:w="120"/>
+              <w:bottom w:type="dxa" w:w="80"/>
+              <w:right w:type="dxa" w:w="120"/>
+            </w:tcMar>
+          </w:tcPr>
+          <w:p>
+            <w:r>
+              <w:rPr>
+                <w:rFonts w:ascii="Malgun Gothic" w:cs="Malgun Gothic" w:eastAsia="Malgun Gothic" w:hAnsi="Malgun Gothic"/>
+                <w:b/>
+                <w:bCs/>
+                <w:sz w:val="20"/>
+                <w:szCs w:val="20"/>
+              </w:rPr>
+              <w:t xml:space="preserve">가격 경쟁력</w:t>
+            </w:r>
+          </w:p>
+        </w:tc>
+        <w:tc>
+          <w:tcPr>
+            <w:tcW w:type="dxa" w:w="4680"/>
+            <w:tcBorders>
+              <w:top w:val="single" w:color="BFBFBF" w:sz="4"/>
+              <w:left w:val="single" w:color="BFBFBF" w:sz="4"/>
+              <w:bottom w:val="single" w:color="BFBFBF" w:sz="4"/>
+              <w:right w:val="single" w:color="BFBFBF" w:sz="4"/>
+            </w:tcBorders>
+            <w:tcMar>
+              <w:top w:type="dxa" w:w="80"/>
+              <w:left w:type="dxa" w:w="120"/>
+              <w:bottom w:type="dxa" w:w="80"/>
+              <w:right w:type="dxa" w:w="120"/>
+            </w:tcMar>
+          </w:tcPr>
+          <w:p>
+            <w:r>
+              <w:rPr>
+                <w:rFonts w:ascii="Malgun Gothic" w:cs="Malgun Gothic" w:eastAsia="Malgun Gothic" w:hAnsi="Malgun Gothic"/>
+                <w:sz w:val="20"/>
+                <w:szCs w:val="20"/>
+              </w:rPr>
+              <w:t xml:space="preserve">✅ 호텔 가격 자체는 저렴</w:t>
+            </w:r>
+          </w:p>
+        </w:tc>
+      </w:tr>
+      <w:tr>
+        <w:tc>
+          <w:tcPr>
+            <w:tcW w:type="dxa" w:w="4680"/>
+            <w:tcBorders>
+              <w:top w:val="single" w:color="BFBFBF" w:sz="4"/>
+              <w:left w:val="single" w:color="BFBFBF" w:sz="4"/>
+              <w:bottom w:val="single" w:color="BFBFBF" w:sz="4"/>
+              <w:right w:val="single" w:color="BFBFBF" w:sz="4"/>
+            </w:tcBorders>
+            <w:tcMar>
+              <w:top w:type="dxa" w:w="80"/>
+              <w:left w:type="dxa" w:w="120"/>
+              <w:bottom w:type="dxa" w:w="80"/>
+              <w:right w:type="dxa" w:w="120"/>
+            </w:tcMar>
+          </w:tcPr>
+          <w:p>
+            <w:r>
+              <w:rPr>
+                <w:rFonts w:ascii="Malgun Gothic" w:cs="Malgun Gothic" w:eastAsia="Malgun Gothic" w:hAnsi="Malgun Gothic"/>
+                <w:b/>
+                <w:bCs/>
+                <w:sz w:val="20"/>
+                <w:szCs w:val="20"/>
+              </w:rPr>
+              <w:t xml:space="preserve">운영 복잡성</w:t>
+            </w:r>
+          </w:p>
+        </w:tc>
+        <w:tc>
+          <w:tcPr>
+            <w:tcW w:type="dxa" w:w="4680"/>
+            <w:tcBorders>
+              <w:top w:val="single" w:color="BFBFBF" w:sz="4"/>
+              <w:left w:val="single" w:color="BFBFBF" w:sz="4"/>
+              <w:bottom w:val="single" w:color="BFBFBF" w:sz="4"/>
+              <w:right w:val="single" w:color="BFBFBF" w:sz="4"/>
+            </w:tcBorders>
+            <w:tcMar>
+              <w:top w:type="dxa" w:w="80"/>
+              <w:left w:type="dxa" w:w="120"/>
+              <w:bottom w:type="dxa" w:w="80"/>
+              <w:right w:type="dxa" w:w="120"/>
+            </w:tcMar>
+          </w:tcPr>
+          <w:p>
+            <w:r>
+              <w:rPr>
+                <w:rFonts w:ascii="Malgun Gothic" w:cs="Malgun Gothic" w:eastAsia="Malgun Gothic" w:hAnsi="Malgun Gothic"/>
+                <w:sz w:val="20"/>
+                <w:szCs w:val="20"/>
+              </w:rPr>
+              <w:t xml:space="preserve">⚠️ 청구 항목 분리 (Invoice 라인 추가)</w:t>
+            </w:r>
+          </w:p>
+        </w:tc>
+      </w:tr>
+      <w:tr>
+        <w:tc>
+          <w:tcPr>
+            <w:tcW w:type="dxa" w:w="4680"/>
+            <w:tcBorders>
+              <w:top w:val="single" w:color="BFBFBF" w:sz="4"/>
+              <w:left w:val="single" w:color="BFBFBF" w:sz="4"/>
+              <w:bottom w:val="single" w:color="BFBFBF" w:sz="4"/>
+              <w:right w:val="single" w:color="BFBFBF" w:sz="4"/>
+            </w:tcBorders>
+            <w:tcMar>
+              <w:top w:type="dxa" w:w="80"/>
+              <w:left w:type="dxa" w:w="120"/>
+              <w:bottom w:type="dxa" w:w="80"/>
+              <w:right w:type="dxa" w:w="120"/>
+            </w:tcMar>
+          </w:tcPr>
+          <w:p>
+            <w:r>
+              <w:rPr>
+                <w:rFonts w:ascii="Malgun Gothic" w:cs="Malgun Gothic" w:eastAsia="Malgun Gothic" w:hAnsi="Malgun Gothic"/>
+                <w:b/>
+                <w:bCs/>
+                <w:sz w:val="20"/>
+                <w:szCs w:val="20"/>
+              </w:rPr>
+              <w:t xml:space="preserve">결제수단 분기</w:t>
+            </w:r>
+          </w:p>
+        </w:tc>
+        <w:tc>
+          <w:tcPr>
+            <w:tcW w:type="dxa" w:w="4680"/>
+            <w:tcBorders>
+              <w:top w:val="single" w:color="BFBFBF" w:sz="4"/>
+              <w:left w:val="single" w:color="BFBFBF" w:sz="4"/>
+              <w:bottom w:val="single" w:color="BFBFBF" w:sz="4"/>
+              <w:right w:val="single" w:color="BFBFBF" w:sz="4"/>
+            </w:tcBorders>
+            <w:tcMar>
+              <w:top w:type="dxa" w:w="80"/>
+              <w:left w:type="dxa" w:w="120"/>
+              <w:bottom w:type="dxa" w:w="80"/>
+              <w:right w:type="dxa" w:w="120"/>
+            </w:tcMar>
+          </w:tcPr>
+          <w:p>
+            <w:r>
+              <w:rPr>
+                <w:rFonts w:ascii="Malgun Gothic" w:cs="Malgun Gothic" w:eastAsia="Malgun Gothic" w:hAnsi="Malgun Gothic"/>
+                <w:sz w:val="20"/>
+                <w:szCs w:val="20"/>
+              </w:rPr>
+              <w:t xml:space="preserve">✅ 송금/카드 별도 가격 가능</w:t>
+            </w:r>
+          </w:p>
+        </w:tc>
+      </w:tr>
+    </w:tbl>
+    <w:p>
+      <w:r>
+        <w:t xml:space="preserve"/>
+      </w:r>
+    </w:p>
+    <w:p>
+      <w:r>
+        <w:t xml:space="preserve"/>
+      </w:r>
+    </w:p>
+    <w:p>
+      <w:pPr>
+        <w:pStyle w:val="Heading4"/>
+        <w:spacing w:after="100" w:before="200"/>
+      </w:pPr>
+      <w:r>
+        <w:rPr>
+          <w:rFonts w:ascii="Malgun Gothic" w:cs="Malgun Gothic" w:eastAsia="Malgun Gothic" w:hAnsi="Malgun Gothic"/>
+          <w:b/>
+          <w:bCs/>
+          <w:sz w:val="22"/>
+          <w:szCs w:val="22"/>
+        </w:rPr>
+        <w:t xml:space="preserve">Ratehawk 방식 (가격 포함)</w:t>
+      </w:r>
+    </w:p>
+    <w:p>
+      <w:r>
+        <w:t xml:space="preserve"/>
+      </w:r>
+    </w:p>
+    <w:tbl>
+      <w:tblPr>
+        <w:tblW w:type="dxa" w:w="9360"/>
+        <w:tblBorders>
+          <w:top w:val="single" w:color="auto" w:sz="4"/>
+          <w:left w:val="single" w:color="auto" w:sz="4"/>
+          <w:bottom w:val="single" w:color="auto" w:sz="4"/>
+          <w:right w:val="single" w:color="auto" w:sz="4"/>
+          <w:insideH w:val="single" w:color="auto" w:sz="4"/>
+          <w:insideV w:val="single" w:color="auto" w:sz="4"/>
+        </w:tblBorders>
+      </w:tblPr>
+      <w:tblGrid>
+        <w:gridCol w:w="4680"/>
+        <w:gridCol w:w="4680"/>
+      </w:tblGrid>
+      <w:tr>
+        <w:trPr>
+          <w:tblHeader/>
+        </w:trPr>
+        <w:tc>
+          <w:tcPr>
+            <w:tcW w:type="dxa" w:w="4680"/>
+            <w:tcBorders>
+              <w:top w:val="single" w:color="BFBFBF" w:sz="4"/>
+              <w:left w:val="single" w:color="BFBFBF" w:sz="4"/>
+              <w:bottom w:val="single" w:color="BFBFBF" w:sz="4"/>
+              <w:right w:val="single" w:color="BFBFBF" w:sz="4"/>
+            </w:tcBorders>
+            <w:shd w:fill="D5E8F0" w:val="clear"/>
+            <w:tcMar>
+              <w:top w:type="dxa" w:w="80"/>
+              <w:left w:type="dxa" w:w="120"/>
+              <w:bottom w:type="dxa" w:w="80"/>
+              <w:right w:type="dxa" w:w="120"/>
+            </w:tcMar>
+          </w:tcPr>
+          <w:p>
+            <w:r>
+              <w:rPr>
+                <w:b/>
+                <w:bCs/>
+              </w:rPr>
+            </w:r>
+          </w:p>
+        </w:tc>
+        <w:tc>
+          <w:tcPr>
+            <w:tcW w:type="dxa" w:w="4680"/>
+            <w:tcBorders>
+              <w:top w:val="single" w:color="BFBFBF" w:sz="4"/>
+              <w:left w:val="single" w:color="BFBFBF" w:sz="4"/>
+              <w:bottom w:val="single" w:color="BFBFBF" w:sz="4"/>
+              <w:right w:val="single" w:color="BFBFBF" w:sz="4"/>
+            </w:tcBorders>
+            <w:shd w:fill="D5E8F0" w:val="clear"/>
+            <w:tcMar>
+              <w:top w:type="dxa" w:w="80"/>
+              <w:left w:type="dxa" w:w="120"/>
+              <w:bottom w:type="dxa" w:w="80"/>
+              <w:right w:type="dxa" w:w="120"/>
+            </w:tcMar>
+          </w:tcPr>
+          <w:p>
+            <w:r>
+              <w:rPr>
+                <w:b/>
+                <w:bCs/>
+              </w:rPr>
+            </w:r>
+          </w:p>
+        </w:tc>
+      </w:tr>
+      <w:tr>
+        <w:tc>
+          <w:tcPr>
+            <w:tcW w:type="dxa" w:w="4680"/>
+            <w:tcBorders>
+              <w:top w:val="single" w:color="BFBFBF" w:sz="4"/>
+              <w:left w:val="single" w:color="BFBFBF" w:sz="4"/>
+              <w:bottom w:val="single" w:color="BFBFBF" w:sz="4"/>
+              <w:right w:val="single" w:color="BFBFBF" w:sz="4"/>
+            </w:tcBorders>
+            <w:tcMar>
+              <w:top w:type="dxa" w:w="80"/>
+              <w:left w:type="dxa" w:w="120"/>
+              <w:bottom w:type="dxa" w:w="80"/>
+              <w:right w:type="dxa" w:w="120"/>
+            </w:tcMar>
+          </w:tcPr>
+          <w:p>
+            <w:r>
+              <w:rPr>
+                <w:rFonts w:ascii="Malgun Gothic" w:cs="Malgun Gothic" w:eastAsia="Malgun Gothic" w:hAnsi="Malgun Gothic"/>
+                <w:b/>
+                <w:bCs/>
+                <w:sz w:val="20"/>
+                <w:szCs w:val="20"/>
+              </w:rPr>
+              <w:t xml:space="preserve">DOTBIZ 마진</w:t>
+            </w:r>
+          </w:p>
+        </w:tc>
+        <w:tc>
+          <w:tcPr>
+            <w:tcW w:type="dxa" w:w="4680"/>
+            <w:tcBorders>
+              <w:top w:val="single" w:color="BFBFBF" w:sz="4"/>
+              <w:left w:val="single" w:color="BFBFBF" w:sz="4"/>
+              <w:bottom w:val="single" w:color="BFBFBF" w:sz="4"/>
+              <w:right w:val="single" w:color="BFBFBF" w:sz="4"/>
+            </w:tcBorders>
+            <w:tcMar>
+              <w:top w:type="dxa" w:w="80"/>
+              <w:left w:type="dxa" w:w="120"/>
+              <w:bottom w:type="dxa" w:w="80"/>
+              <w:right w:type="dxa" w:w="120"/>
+            </w:tcMar>
+          </w:tcPr>
+          <w:p>
+            <w:r>
+              <w:rPr>
+                <w:rFonts w:ascii="Malgun Gothic" w:cs="Malgun Gothic" w:eastAsia="Malgun Gothic" w:hAnsi="Malgun Gothic"/>
+                <w:sz w:val="20"/>
+                <w:szCs w:val="20"/>
+              </w:rPr>
+              <w:t xml:space="preserve">⚠️ 호텔 마진/마크업 잠식</w:t>
+            </w:r>
+          </w:p>
+        </w:tc>
+      </w:tr>
+      <w:tr>
+        <w:tc>
+          <w:tcPr>
+            <w:tcW w:type="dxa" w:w="4680"/>
+            <w:tcBorders>
+              <w:top w:val="single" w:color="BFBFBF" w:sz="4"/>
+              <w:left w:val="single" w:color="BFBFBF" w:sz="4"/>
+              <w:bottom w:val="single" w:color="BFBFBF" w:sz="4"/>
+              <w:right w:val="single" w:color="BFBFBF" w:sz="4"/>
+            </w:tcBorders>
+            <w:tcMar>
+              <w:top w:type="dxa" w:w="80"/>
+              <w:left w:type="dxa" w:w="120"/>
+              <w:bottom w:type="dxa" w:w="80"/>
+              <w:right w:type="dxa" w:w="120"/>
+            </w:tcMar>
+          </w:tcPr>
+          <w:p>
+            <w:r>
+              <w:rPr>
+                <w:rFonts w:ascii="Malgun Gothic" w:cs="Malgun Gothic" w:eastAsia="Malgun Gothic" w:hAnsi="Malgun Gothic"/>
+                <w:b/>
+                <w:bCs/>
+                <w:sz w:val="20"/>
+                <w:szCs w:val="20"/>
+              </w:rPr>
+              <w:t xml:space="preserve">고객 인식</w:t>
+            </w:r>
+          </w:p>
+        </w:tc>
+        <w:tc>
+          <w:tcPr>
+            <w:tcW w:type="dxa" w:w="4680"/>
+            <w:tcBorders>
+              <w:top w:val="single" w:color="BFBFBF" w:sz="4"/>
+              <w:left w:val="single" w:color="BFBFBF" w:sz="4"/>
+              <w:bottom w:val="single" w:color="BFBFBF" w:sz="4"/>
+              <w:right w:val="single" w:color="BFBFBF" w:sz="4"/>
+            </w:tcBorders>
+            <w:tcMar>
+              <w:top w:type="dxa" w:w="80"/>
+              <w:left w:type="dxa" w:w="120"/>
+              <w:bottom w:type="dxa" w:w="80"/>
+              <w:right w:type="dxa" w:w="120"/>
+            </w:tcMar>
+          </w:tcPr>
+          <w:p>
+            <w:r>
+              <w:rPr>
+                <w:rFonts w:ascii="Malgun Gothic" w:cs="Malgun Gothic" w:eastAsia="Malgun Gothic" w:hAnsi="Malgun Gothic"/>
+                <w:sz w:val="20"/>
+                <w:szCs w:val="20"/>
+              </w:rPr>
+              <w:t xml:space="preserve">✅ 단일 가격 (UX 깔끔)</w:t>
+            </w:r>
+          </w:p>
+        </w:tc>
+      </w:tr>
+      <w:tr>
+        <w:tc>
+          <w:tcPr>
+            <w:tcW w:type="dxa" w:w="4680"/>
+            <w:tcBorders>
+              <w:top w:val="single" w:color="BFBFBF" w:sz="4"/>
+              <w:left w:val="single" w:color="BFBFBF" w:sz="4"/>
+              <w:bottom w:val="single" w:color="BFBFBF" w:sz="4"/>
+              <w:right w:val="single" w:color="BFBFBF" w:sz="4"/>
+            </w:tcBorders>
+            <w:tcMar>
+              <w:top w:type="dxa" w:w="80"/>
+              <w:left w:type="dxa" w:w="120"/>
+              <w:bottom w:type="dxa" w:w="80"/>
+              <w:right w:type="dxa" w:w="120"/>
+            </w:tcMar>
+          </w:tcPr>
+          <w:p>
+            <w:r>
+              <w:rPr>
+                <w:rFonts w:ascii="Malgun Gothic" w:cs="Malgun Gothic" w:eastAsia="Malgun Gothic" w:hAnsi="Malgun Gothic"/>
+                <w:b/>
+                <w:bCs/>
+                <w:sz w:val="20"/>
+                <w:szCs w:val="20"/>
+              </w:rPr>
+              <w:t xml:space="preserve">가격 경쟁력</w:t>
+            </w:r>
+          </w:p>
+        </w:tc>
+        <w:tc>
+          <w:tcPr>
+            <w:tcW w:type="dxa" w:w="4680"/>
+            <w:tcBorders>
+              <w:top w:val="single" w:color="BFBFBF" w:sz="4"/>
+              <w:left w:val="single" w:color="BFBFBF" w:sz="4"/>
+              <w:bottom w:val="single" w:color="BFBFBF" w:sz="4"/>
+              <w:right w:val="single" w:color="BFBFBF" w:sz="4"/>
+            </w:tcBorders>
+            <w:tcMar>
+              <w:top w:type="dxa" w:w="80"/>
+              <w:left w:type="dxa" w:w="120"/>
+              <w:bottom w:type="dxa" w:w="80"/>
+              <w:right w:type="dxa" w:w="120"/>
+            </w:tcMar>
+          </w:tcPr>
+          <w:p>
+            <w:r>
+              <w:rPr>
+                <w:rFonts w:ascii="Malgun Gothic" w:cs="Malgun Gothic" w:eastAsia="Malgun Gothic" w:hAnsi="Malgun Gothic"/>
+                <w:sz w:val="20"/>
+                <w:szCs w:val="20"/>
+              </w:rPr>
+              <w:t xml:space="preserve">⚠️ 표시가 인상 (비교 시 불리)</w:t>
+            </w:r>
+          </w:p>
+        </w:tc>
+      </w:tr>
+      <w:tr>
+        <w:tc>
+          <w:tcPr>
+            <w:tcW w:type="dxa" w:w="4680"/>
+            <w:tcBorders>
+              <w:top w:val="single" w:color="BFBFBF" w:sz="4"/>
+              <w:left w:val="single" w:color="BFBFBF" w:sz="4"/>
+              <w:bottom w:val="single" w:color="BFBFBF" w:sz="4"/>
+              <w:right w:val="single" w:color="BFBFBF" w:sz="4"/>
+            </w:tcBorders>
+            <w:tcMar>
+              <w:top w:type="dxa" w:w="80"/>
+              <w:left w:type="dxa" w:w="120"/>
+              <w:bottom w:type="dxa" w:w="80"/>
+              <w:right w:type="dxa" w:w="120"/>
+            </w:tcMar>
+          </w:tcPr>
+          <w:p>
+            <w:r>
+              <w:rPr>
+                <w:rFonts w:ascii="Malgun Gothic" w:cs="Malgun Gothic" w:eastAsia="Malgun Gothic" w:hAnsi="Malgun Gothic"/>
+                <w:b/>
+                <w:bCs/>
+                <w:sz w:val="20"/>
+                <w:szCs w:val="20"/>
+              </w:rPr>
+              <w:t xml:space="preserve">운영 복잡성</w:t>
+            </w:r>
+          </w:p>
+        </w:tc>
+        <w:tc>
+          <w:tcPr>
+            <w:tcW w:type="dxa" w:w="4680"/>
+            <w:tcBorders>
+              <w:top w:val="single" w:color="BFBFBF" w:sz="4"/>
+              <w:left w:val="single" w:color="BFBFBF" w:sz="4"/>
+              <w:bottom w:val="single" w:color="BFBFBF" w:sz="4"/>
+              <w:right w:val="single" w:color="BFBFBF" w:sz="4"/>
+            </w:tcBorders>
+            <w:tcMar>
+              <w:top w:type="dxa" w:w="80"/>
+              <w:left w:type="dxa" w:w="120"/>
+              <w:bottom w:type="dxa" w:w="80"/>
+              <w:right w:type="dxa" w:w="120"/>
+            </w:tcMar>
+          </w:tcPr>
+          <w:p>
+            <w:r>
+              <w:rPr>
+                <w:rFonts w:ascii="Malgun Gothic" w:cs="Malgun Gothic" w:eastAsia="Malgun Gothic" w:hAnsi="Malgun Gothic"/>
+                <w:sz w:val="20"/>
+                <w:szCs w:val="20"/>
+              </w:rPr>
+              <w:t xml:space="preserve">✅ 단순</w:t>
+            </w:r>
+          </w:p>
+        </w:tc>
+      </w:tr>
+      <w:tr>
+        <w:tc>
+          <w:tcPr>
+            <w:tcW w:type="dxa" w:w="4680"/>
+            <w:tcBorders>
+              <w:top w:val="single" w:color="BFBFBF" w:sz="4"/>
+              <w:left w:val="single" w:color="BFBFBF" w:sz="4"/>
+              <w:bottom w:val="single" w:color="BFBFBF" w:sz="4"/>
+              <w:right w:val="single" w:color="BFBFBF" w:sz="4"/>
+            </w:tcBorders>
+            <w:tcMar>
+              <w:top w:type="dxa" w:w="80"/>
+              <w:left w:type="dxa" w:w="120"/>
+              <w:bottom w:type="dxa" w:w="80"/>
+              <w:right w:type="dxa" w:w="120"/>
+            </w:tcMar>
+          </w:tcPr>
+          <w:p>
+            <w:r>
+              <w:rPr>
+                <w:rFonts w:ascii="Malgun Gothic" w:cs="Malgun Gothic" w:eastAsia="Malgun Gothic" w:hAnsi="Malgun Gothic"/>
+                <w:b/>
+                <w:bCs/>
+                <w:sz w:val="20"/>
+                <w:szCs w:val="20"/>
+              </w:rPr>
+              <w:t xml:space="preserve">결제수단 분기</w:t>
+            </w:r>
+          </w:p>
+        </w:tc>
+        <w:tc>
+          <w:tcPr>
+            <w:tcW w:type="dxa" w:w="4680"/>
+            <w:tcBorders>
+              <w:top w:val="single" w:color="BFBFBF" w:sz="4"/>
+              <w:left w:val="single" w:color="BFBFBF" w:sz="4"/>
+              <w:bottom w:val="single" w:color="BFBFBF" w:sz="4"/>
+              <w:right w:val="single" w:color="BFBFBF" w:sz="4"/>
+            </w:tcBorders>
+            <w:tcMar>
+              <w:top w:type="dxa" w:w="80"/>
+              <w:left w:type="dxa" w:w="120"/>
+              <w:bottom w:type="dxa" w:w="80"/>
+              <w:right w:type="dxa" w:w="120"/>
+            </w:tcMar>
+          </w:tcPr>
+          <w:p>
+            <w:r>
+              <w:rPr>
+                <w:rFonts w:ascii="Malgun Gothic" w:cs="Malgun Gothic" w:eastAsia="Malgun Gothic" w:hAnsi="Malgun Gothic"/>
+                <w:sz w:val="20"/>
+                <w:szCs w:val="20"/>
+              </w:rPr>
+              <w:t xml:space="preserve">❌ 어려움 (단일 가격)</w:t>
+            </w:r>
+          </w:p>
+        </w:tc>
+      </w:tr>
+    </w:tbl>
+    <w:p>
+      <w:r>
+        <w:t xml:space="preserve"/>
+      </w:r>
+    </w:p>
+    <w:p>
+      <w:r>
+        <w:t xml:space="preserve"/>
+      </w:r>
+    </w:p>
+    <w:p>
+      <w:pPr>
+        <w:pStyle w:val="Heading3"/>
+        <w:spacing w:after="120" w:before="240"/>
+      </w:pPr>
+      <w:r>
+        <w:rPr>
+          <w:rFonts w:ascii="Malgun Gothic" w:cs="Malgun Gothic" w:eastAsia="Malgun Gothic" w:hAnsi="Malgun Gothic"/>
+          <w:b/>
+          <w:bCs/>
+          <w:sz w:val="26"/>
+          <w:szCs w:val="26"/>
+        </w:rPr>
+        <w:t xml:space="preserve">권장 — 하이브리드 모델 (시장 검증된 두 패턴 결합)</w:t>
+      </w:r>
+    </w:p>
+    <w:p>
+      <w:r>
+        <w:t xml:space="preserve"/>
+      </w:r>
+    </w:p>
+    <w:p>
+      <w:pPr>
+        <w:spacing w:after="80"/>
+      </w:pPr>
+      <w:r>
+        <w:rPr>
+          <w:rFonts w:ascii="Malgun Gothic" w:cs="Malgun Gothic" w:eastAsia="Malgun Gothic" w:hAnsi="Malgun Gothic"/>
+          <w:sz w:val="20"/>
+          <w:szCs w:val="20"/>
+        </w:rPr>
+        <w:t xml:space="preserve">DOTBIZ가 두 방식 중 하나만 채택하기보다 </w:t>
+      </w:r>
+      <w:r>
+        <w:rPr>
+          <w:rFonts w:ascii="Malgun Gothic" w:cs="Malgun Gothic" w:eastAsia="Malgun Gothic" w:hAnsi="Malgun Gothic"/>
+          <w:b/>
+          <w:bCs/>
+          <w:sz w:val="20"/>
+          <w:szCs w:val="20"/>
+        </w:rPr>
+        <w:t xml:space="preserve">거래 유형/고객 규모별로 분기 운영</w:t>
+      </w:r>
+      <w:r>
+        <w:rPr>
+          <w:rFonts w:ascii="Malgun Gothic" w:cs="Malgun Gothic" w:eastAsia="Malgun Gothic" w:hAnsi="Malgun Gothic"/>
+          <w:sz w:val="20"/>
+          <w:szCs w:val="20"/>
+        </w:rPr>
+        <w:t xml:space="preserve"> 권장:</w:t>
+      </w:r>
+    </w:p>
+    <w:p>
+      <w:r>
+        <w:t xml:space="preserve"/>
+      </w:r>
+    </w:p>
+    <w:p>
+      <w:pPr>
+        <w:shd w:fill="F5F5F5" w:val="clear"/>
+        <w:spacing w:after="80" w:before="80"/>
+      </w:pPr>
+      <w:r>
+        <w:rPr>
+          <w:rFonts w:ascii="Consolas" w:cs="Consolas" w:eastAsia="Consolas" w:hAnsi="Consolas"/>
+          <w:sz w:val="18"/>
+          <w:szCs w:val="18"/>
+        </w:rPr>
+        <w:t xml:space="preserve">                  ┌─ 단일 표시가 (호텔 가격 + PG 흡수)
+                  │   (Ratehawk 방식)
+   Free Cancel ──┤   Non-refundable (호텔 마진 8~12% 활용)
+                  │
+                  └─ 송금 옵션 (PG 0%) — 별도 안내
+   POSTPAY 정산 ──── 송금 (PG 0%) — Net-30 청구 (TBO 방식 변형)
+   대형 고객사 ──── 계약 협의로 결제수수료 별도 명시 (TBO 방식)
+   (월 TTV 5억+)</w:t>
+      </w:r>
+    </w:p>
+    <w:p>
+      <w:r>
+        <w:t xml:space="preserve"/>
+      </w:r>
+    </w:p>
+    <w:p>
+      <w:pPr>
+        <w:pStyle w:val="Heading3"/>
+        <w:spacing w:after="120" w:before="240"/>
+      </w:pPr>
+      <w:r>
+        <w:rPr>
+          <w:rFonts w:ascii="Malgun Gothic" w:cs="Malgun Gothic" w:eastAsia="Malgun Gothic" w:hAnsi="Malgun Gothic"/>
+          <w:b/>
+          <w:bCs/>
+          <w:sz w:val="26"/>
+          <w:szCs w:val="26"/>
+        </w:rPr>
+        <w:t xml:space="preserve">모델별 적용 정책 (결재 결과 반영)</w:t>
+      </w:r>
+    </w:p>
+    <w:p>
+      <w:r>
+        <w:t xml:space="preserve"/>
+      </w:r>
+    </w:p>
+    <w:tbl>
+      <w:tblPr>
+        <w:tblW w:type="dxa" w:w="9360"/>
+        <w:tblBorders>
+          <w:top w:val="single" w:color="auto" w:sz="4"/>
+          <w:left w:val="single" w:color="auto" w:sz="4"/>
+          <w:bottom w:val="single" w:color="auto" w:sz="4"/>
+          <w:right w:val="single" w:color="auto" w:sz="4"/>
+          <w:insideH w:val="single" w:color="auto" w:sz="4"/>
+          <w:insideV w:val="single" w:color="auto" w:sz="4"/>
+        </w:tblBorders>
+      </w:tblPr>
+      <w:tblGrid>
+        <w:gridCol w:w="2340"/>
+        <w:gridCol w:w="2340"/>
+        <w:gridCol w:w="2340"/>
+        <w:gridCol w:w="2340"/>
+      </w:tblGrid>
+      <w:tr>
+        <w:trPr>
+          <w:tblHeader/>
+        </w:trPr>
+        <w:tc>
+          <w:tcPr>
+            <w:tcW w:type="dxa" w:w="2340"/>
+            <w:tcBorders>
+              <w:top w:val="single" w:color="BFBFBF" w:sz="4"/>
+              <w:left w:val="single" w:color="BFBFBF" w:sz="4"/>
+              <w:bottom w:val="single" w:color="BFBFBF" w:sz="4"/>
+              <w:right w:val="single" w:color="BFBFBF" w:sz="4"/>
+            </w:tcBorders>
+            <w:shd w:fill="D5E8F0" w:val="clear"/>
+            <w:tcMar>
+              <w:top w:type="dxa" w:w="80"/>
+              <w:left w:type="dxa" w:w="120"/>
+              <w:bottom w:type="dxa" w:w="80"/>
+              <w:right w:type="dxa" w:w="120"/>
+            </w:tcMar>
+          </w:tcPr>
+          <w:p>
+            <w:r>
+              <w:rPr>
+                <w:b/>
+                <w:bCs/>
+              </w:rPr>
+            </w:r>
+          </w:p>
+        </w:tc>
+        <w:tc>
+          <w:tcPr>
+            <w:tcW w:type="dxa" w:w="2340"/>
+            <w:tcBorders>
+              <w:top w:val="single" w:color="BFBFBF" w:sz="4"/>
+              <w:left w:val="single" w:color="BFBFBF" w:sz="4"/>
+              <w:bottom w:val="single" w:color="BFBFBF" w:sz="4"/>
+              <w:right w:val="single" w:color="BFBFBF" w:sz="4"/>
+            </w:tcBorders>
+            <w:shd w:fill="D5E8F0" w:val="clear"/>
+            <w:tcMar>
+              <w:top w:type="dxa" w:w="80"/>
+              <w:left w:type="dxa" w:w="120"/>
+              <w:bottom w:type="dxa" w:w="80"/>
+              <w:right w:type="dxa" w:w="120"/>
+            </w:tcMar>
+          </w:tcPr>
+          <w:p>
+            <w:r>
+              <w:rPr>
+                <w:b/>
+                <w:bCs/>
+              </w:rPr>
+            </w:r>
+          </w:p>
+        </w:tc>
+        <w:tc>
+          <w:tcPr>
+            <w:tcW w:type="dxa" w:w="2340"/>
+            <w:tcBorders>
+              <w:top w:val="single" w:color="BFBFBF" w:sz="4"/>
+              <w:left w:val="single" w:color="BFBFBF" w:sz="4"/>
+              <w:bottom w:val="single" w:color="BFBFBF" w:sz="4"/>
+              <w:right w:val="single" w:color="BFBFBF" w:sz="4"/>
+            </w:tcBorders>
+            <w:shd w:fill="D5E8F0" w:val="clear"/>
+            <w:tcMar>
+              <w:top w:type="dxa" w:w="80"/>
+              <w:left w:type="dxa" w:w="120"/>
+              <w:bottom w:type="dxa" w:w="80"/>
+              <w:right w:type="dxa" w:w="120"/>
+            </w:tcMar>
+          </w:tcPr>
+          <w:p>
+            <w:r>
+              <w:rPr>
+                <w:b/>
+                <w:bCs/>
+              </w:rPr>
+            </w:r>
+          </w:p>
+        </w:tc>
+        <w:tc>
+          <w:tcPr>
+            <w:tcW w:type="dxa" w:w="2340"/>
+            <w:tcBorders>
+              <w:top w:val="single" w:color="BFBFBF" w:sz="4"/>
+              <w:left w:val="single" w:color="BFBFBF" w:sz="4"/>
+              <w:bottom w:val="single" w:color="BFBFBF" w:sz="4"/>
+              <w:right w:val="single" w:color="BFBFBF" w:sz="4"/>
+            </w:tcBorders>
+            <w:shd w:fill="D5E8F0" w:val="clear"/>
+            <w:tcMar>
+              <w:top w:type="dxa" w:w="80"/>
+              <w:left w:type="dxa" w:w="120"/>
+              <w:bottom w:type="dxa" w:w="80"/>
+              <w:right w:type="dxa" w:w="120"/>
+            </w:tcMar>
+          </w:tcPr>
+          <w:p>
+            <w:r>
+              <w:rPr>
+                <w:b/>
+                <w:bCs/>
+              </w:rPr>
+            </w:r>
+          </w:p>
+        </w:tc>
+      </w:tr>
+      <w:tr>
+        <w:tc>
+          <w:tcPr>
+            <w:tcW w:type="dxa" w:w="2340"/>
+            <w:tcBorders>
+              <w:top w:val="single" w:color="BFBFBF" w:sz="4"/>
+              <w:left w:val="single" w:color="BFBFBF" w:sz="4"/>
+              <w:bottom w:val="single" w:color="BFBFBF" w:sz="4"/>
+              <w:right w:val="single" w:color="BFBFBF" w:sz="4"/>
+            </w:tcBorders>
+            <w:tcMar>
+              <w:top w:type="dxa" w:w="80"/>
+              <w:left w:type="dxa" w:w="120"/>
+              <w:bottom w:type="dxa" w:w="80"/>
+              <w:right w:type="dxa" w:w="120"/>
+            </w:tcMar>
+          </w:tcPr>
+          <w:p>
+            <w:r>
+              <w:rPr>
+                <w:rFonts w:ascii="Malgun Gothic" w:cs="Malgun Gothic" w:eastAsia="Malgun Gothic" w:hAnsi="Malgun Gothic"/>
+                <w:b/>
+                <w:bCs/>
+                <w:sz w:val="20"/>
+                <w:szCs w:val="20"/>
+              </w:rPr>
+              <w:t xml:space="preserve">Free Cancel + TL 미도래</w:t>
+            </w:r>
+          </w:p>
+        </w:tc>
+        <w:tc>
+          <w:tcPr>
+            <w:tcW w:type="dxa" w:w="2340"/>
+            <w:tcBorders>
+              <w:top w:val="single" w:color="BFBFBF" w:sz="4"/>
+              <w:left w:val="single" w:color="BFBFBF" w:sz="4"/>
+              <w:bottom w:val="single" w:color="BFBFBF" w:sz="4"/>
+              <w:right w:val="single" w:color="BFBFBF" w:sz="4"/>
+            </w:tcBorders>
+            <w:tcMar>
+              <w:top w:type="dxa" w:w="80"/>
+              <w:left w:type="dxa" w:w="120"/>
+              <w:bottom w:type="dxa" w:w="80"/>
+              <w:right w:type="dxa" w:w="120"/>
+            </w:tcMar>
+          </w:tcPr>
+          <w:p>
+            <w:r>
+              <w:rPr>
+                <w:rFonts w:ascii="Malgun Gothic" w:cs="Malgun Gothic" w:eastAsia="Malgun Gothic" w:hAnsi="Malgun Gothic"/>
+                <w:sz w:val="20"/>
+                <w:szCs w:val="20"/>
+              </w:rPr>
+              <w:t xml:space="preserve">송금 우선</w:t>
+            </w:r>
+          </w:p>
+        </w:tc>
+        <w:tc>
+          <w:tcPr>
+            <w:tcW w:type="dxa" w:w="2340"/>
+            <w:tcBorders>
+              <w:top w:val="single" w:color="BFBFBF" w:sz="4"/>
+              <w:left w:val="single" w:color="BFBFBF" w:sz="4"/>
+              <w:bottom w:val="single" w:color="BFBFBF" w:sz="4"/>
+              <w:right w:val="single" w:color="BFBFBF" w:sz="4"/>
+            </w:tcBorders>
+            <w:tcMar>
+              <w:top w:type="dxa" w:w="80"/>
+              <w:left w:type="dxa" w:w="120"/>
+              <w:bottom w:type="dxa" w:w="80"/>
+              <w:right w:type="dxa" w:w="120"/>
+            </w:tcMar>
+          </w:tcPr>
+          <w:p>
+            <w:r>
+              <w:rPr>
+                <w:rFonts w:ascii="Malgun Gothic" w:cs="Malgun Gothic" w:eastAsia="Malgun Gothic" w:hAnsi="Malgun Gothic"/>
+                <w:sz w:val="20"/>
+                <w:szCs w:val="20"/>
+              </w:rPr>
+              <w:t xml:space="preserve">0% (DOTBIZ/고객 부담 없음)</w:t>
+            </w:r>
+          </w:p>
+        </w:tc>
+        <w:tc>
+          <w:tcPr>
+            <w:tcW w:type="dxa" w:w="2340"/>
+            <w:tcBorders>
+              <w:top w:val="single" w:color="BFBFBF" w:sz="4"/>
+              <w:left w:val="single" w:color="BFBFBF" w:sz="4"/>
+              <w:bottom w:val="single" w:color="BFBFBF" w:sz="4"/>
+              <w:right w:val="single" w:color="BFBFBF" w:sz="4"/>
+            </w:tcBorders>
+            <w:tcMar>
+              <w:top w:type="dxa" w:w="80"/>
+              <w:left w:type="dxa" w:w="120"/>
+              <w:bottom w:type="dxa" w:w="80"/>
+              <w:right w:type="dxa" w:w="120"/>
+            </w:tcMar>
+          </w:tcPr>
+          <w:p>
+            <w:r>
+              <w:rPr>
+                <w:rFonts w:ascii="Malgun Gothic" w:cs="Malgun Gothic" w:eastAsia="Malgun Gothic" w:hAnsi="Malgun Gothic"/>
+                <w:sz w:val="20"/>
+                <w:szCs w:val="20"/>
+              </w:rPr>
+              <w:t xml:space="preserve">—</w:t>
+            </w:r>
+          </w:p>
+        </w:tc>
+      </w:tr>
+      <w:tr>
+        <w:tc>
+          <w:tcPr>
+            <w:tcW w:type="dxa" w:w="2340"/>
+            <w:tcBorders>
+              <w:top w:val="single" w:color="BFBFBF" w:sz="4"/>
+              <w:left w:val="single" w:color="BFBFBF" w:sz="4"/>
+              <w:bottom w:val="single" w:color="BFBFBF" w:sz="4"/>
+              <w:right w:val="single" w:color="BFBFBF" w:sz="4"/>
+            </w:tcBorders>
+            <w:tcMar>
+              <w:top w:type="dxa" w:w="80"/>
+              <w:left w:type="dxa" w:w="120"/>
+              <w:bottom w:type="dxa" w:w="80"/>
+              <w:right w:type="dxa" w:w="120"/>
+            </w:tcMar>
+          </w:tcPr>
+          <w:p>
+            <w:r>
+              <w:rPr>
+                <w:rFonts w:ascii="Malgun Gothic" w:cs="Malgun Gothic" w:eastAsia="Malgun Gothic" w:hAnsi="Malgun Gothic"/>
+                <w:sz w:val="20"/>
+                <w:szCs w:val="20"/>
+              </w:rPr>
+              <w:t xml:space="preserve">동 + 카드 결제 선택</w:t>
+            </w:r>
+          </w:p>
+        </w:tc>
+        <w:tc>
+          <w:tcPr>
+            <w:tcW w:type="dxa" w:w="2340"/>
+            <w:tcBorders>
+              <w:top w:val="single" w:color="BFBFBF" w:sz="4"/>
+              <w:left w:val="single" w:color="BFBFBF" w:sz="4"/>
+              <w:bottom w:val="single" w:color="BFBFBF" w:sz="4"/>
+              <w:right w:val="single" w:color="BFBFBF" w:sz="4"/>
+            </w:tcBorders>
+            <w:tcMar>
+              <w:top w:type="dxa" w:w="80"/>
+              <w:left w:type="dxa" w:w="120"/>
+              <w:bottom w:type="dxa" w:w="80"/>
+              <w:right w:type="dxa" w:w="120"/>
+            </w:tcMar>
+          </w:tcPr>
+          <w:p>
+            <w:r>
+              <w:rPr>
+                <w:rFonts w:ascii="Malgun Gothic" w:cs="Malgun Gothic" w:eastAsia="Malgun Gothic" w:hAnsi="Malgun Gothic"/>
+                <w:sz w:val="20"/>
+                <w:szCs w:val="20"/>
+              </w:rPr>
+              <w:t xml:space="preserve">카드</w:t>
+            </w:r>
+          </w:p>
+        </w:tc>
+        <w:tc>
+          <w:tcPr>
+            <w:tcW w:type="dxa" w:w="2340"/>
+            <w:tcBorders>
+              <w:top w:val="single" w:color="BFBFBF" w:sz="4"/>
+              <w:left w:val="single" w:color="BFBFBF" w:sz="4"/>
+              <w:bottom w:val="single" w:color="BFBFBF" w:sz="4"/>
+              <w:right w:val="single" w:color="BFBFBF" w:sz="4"/>
+            </w:tcBorders>
+            <w:tcMar>
+              <w:top w:type="dxa" w:w="80"/>
+              <w:left w:type="dxa" w:w="120"/>
+              <w:bottom w:type="dxa" w:w="80"/>
+              <w:right w:type="dxa" w:w="120"/>
+            </w:tcMar>
+          </w:tcPr>
+          <w:p>
+            <w:r>
+              <w:rPr>
+                <w:rFonts w:ascii="Malgun Gothic" w:cs="Malgun Gothic" w:eastAsia="Malgun Gothic" w:hAnsi="Malgun Gothic"/>
+                <w:sz w:val="20"/>
+                <w:szCs w:val="20"/>
+              </w:rPr>
+              <w:t xml:space="preserve">단일 표시가에 흡수</w:t>
+            </w:r>
+          </w:p>
+        </w:tc>
+        <w:tc>
+          <w:tcPr>
+            <w:tcW w:type="dxa" w:w="2340"/>
+            <w:tcBorders>
+              <w:top w:val="single" w:color="BFBFBF" w:sz="4"/>
+              <w:left w:val="single" w:color="BFBFBF" w:sz="4"/>
+              <w:bottom w:val="single" w:color="BFBFBF" w:sz="4"/>
+              <w:right w:val="single" w:color="BFBFBF" w:sz="4"/>
+            </w:tcBorders>
+            <w:tcMar>
+              <w:top w:type="dxa" w:w="80"/>
+              <w:left w:type="dxa" w:w="120"/>
+              <w:bottom w:type="dxa" w:w="80"/>
+              <w:right w:type="dxa" w:w="120"/>
+            </w:tcMar>
+          </w:tcPr>
+          <w:p>
+            <w:r>
+              <w:rPr>
+                <w:rFonts w:ascii="Malgun Gothic" w:cs="Malgun Gothic" w:eastAsia="Malgun Gothic" w:hAnsi="Malgun Gothic"/>
+                <w:sz w:val="20"/>
+                <w:szCs w:val="20"/>
+              </w:rPr>
+              <w:t xml:space="preserve">Ratehawk</w:t>
+            </w:r>
+          </w:p>
+        </w:tc>
+      </w:tr>
+      <w:tr>
+        <w:tc>
+          <w:tcPr>
+            <w:tcW w:type="dxa" w:w="2340"/>
+            <w:tcBorders>
+              <w:top w:val="single" w:color="BFBFBF" w:sz="4"/>
+              <w:left w:val="single" w:color="BFBFBF" w:sz="4"/>
+              <w:bottom w:val="single" w:color="BFBFBF" w:sz="4"/>
+              <w:right w:val="single" w:color="BFBFBF" w:sz="4"/>
+            </w:tcBorders>
+            <w:tcMar>
+              <w:top w:type="dxa" w:w="80"/>
+              <w:left w:type="dxa" w:w="120"/>
+              <w:bottom w:type="dxa" w:w="80"/>
+              <w:right w:type="dxa" w:w="120"/>
+            </w:tcMar>
+          </w:tcPr>
+          <w:p>
+            <w:r>
+              <w:rPr>
+                <w:rFonts w:ascii="Malgun Gothic" w:cs="Malgun Gothic" w:eastAsia="Malgun Gothic" w:hAnsi="Malgun Gothic"/>
+                <w:b/>
+                <w:bCs/>
+                <w:sz w:val="20"/>
+                <w:szCs w:val="20"/>
+              </w:rPr>
+              <w:t xml:space="preserve">Non-refundable</w:t>
+            </w:r>
+          </w:p>
+        </w:tc>
+        <w:tc>
+          <w:tcPr>
+            <w:tcW w:type="dxa" w:w="2340"/>
+            <w:tcBorders>
+              <w:top w:val="single" w:color="BFBFBF" w:sz="4"/>
+              <w:left w:val="single" w:color="BFBFBF" w:sz="4"/>
+              <w:bottom w:val="single" w:color="BFBFBF" w:sz="4"/>
+              <w:right w:val="single" w:color="BFBFBF" w:sz="4"/>
+            </w:tcBorders>
+            <w:tcMar>
+              <w:top w:type="dxa" w:w="80"/>
+              <w:left w:type="dxa" w:w="120"/>
+              <w:bottom w:type="dxa" w:w="80"/>
+              <w:right w:type="dxa" w:w="120"/>
+            </w:tcMar>
+          </w:tcPr>
+          <w:p>
+            <w:r>
+              <w:rPr>
+                <w:rFonts w:ascii="Malgun Gothic" w:cs="Malgun Gothic" w:eastAsia="Malgun Gothic" w:hAnsi="Malgun Gothic"/>
+                <w:sz w:val="20"/>
+                <w:szCs w:val="20"/>
+              </w:rPr>
+              <w:t xml:space="preserve">카드 강제</w:t>
+            </w:r>
+          </w:p>
+        </w:tc>
+        <w:tc>
+          <w:tcPr>
+            <w:tcW w:type="dxa" w:w="2340"/>
+            <w:tcBorders>
+              <w:top w:val="single" w:color="BFBFBF" w:sz="4"/>
+              <w:left w:val="single" w:color="BFBFBF" w:sz="4"/>
+              <w:bottom w:val="single" w:color="BFBFBF" w:sz="4"/>
+              <w:right w:val="single" w:color="BFBFBF" w:sz="4"/>
+            </w:tcBorders>
+            <w:tcMar>
+              <w:top w:type="dxa" w:w="80"/>
+              <w:left w:type="dxa" w:w="120"/>
+              <w:bottom w:type="dxa" w:w="80"/>
+              <w:right w:type="dxa" w:w="120"/>
+            </w:tcMar>
+          </w:tcPr>
+          <w:p>
+            <w:r>
+              <w:rPr>
+                <w:rFonts w:ascii="Malgun Gothic" w:cs="Malgun Gothic" w:eastAsia="Malgun Gothic" w:hAnsi="Malgun Gothic"/>
+                <w:sz w:val="20"/>
+                <w:szCs w:val="20"/>
+              </w:rPr>
+              <w:t xml:space="preserve">호텔 마진 활용 흡수</w:t>
+            </w:r>
+          </w:p>
+        </w:tc>
+        <w:tc>
+          <w:tcPr>
+            <w:tcW w:type="dxa" w:w="2340"/>
+            <w:tcBorders>
+              <w:top w:val="single" w:color="BFBFBF" w:sz="4"/>
+              <w:left w:val="single" w:color="BFBFBF" w:sz="4"/>
+              <w:bottom w:val="single" w:color="BFBFBF" w:sz="4"/>
+              <w:right w:val="single" w:color="BFBFBF" w:sz="4"/>
+            </w:tcBorders>
+            <w:tcMar>
+              <w:top w:type="dxa" w:w="80"/>
+              <w:left w:type="dxa" w:w="120"/>
+              <w:bottom w:type="dxa" w:w="80"/>
+              <w:right w:type="dxa" w:w="120"/>
+            </w:tcMar>
+          </w:tcPr>
+          <w:p>
+            <w:r>
+              <w:rPr>
+                <w:rFonts w:ascii="Malgun Gothic" w:cs="Malgun Gothic" w:eastAsia="Malgun Gothic" w:hAnsi="Malgun Gothic"/>
+                <w:sz w:val="20"/>
+                <w:szCs w:val="20"/>
+              </w:rPr>
+              <w:t xml:space="preserve">Ratehawk</w:t>
+            </w:r>
+          </w:p>
+        </w:tc>
+      </w:tr>
+      <w:tr>
+        <w:tc>
+          <w:tcPr>
+            <w:tcW w:type="dxa" w:w="2340"/>
+            <w:tcBorders>
+              <w:top w:val="single" w:color="BFBFBF" w:sz="4"/>
+              <w:left w:val="single" w:color="BFBFBF" w:sz="4"/>
+              <w:bottom w:val="single" w:color="BFBFBF" w:sz="4"/>
+              <w:right w:val="single" w:color="BFBFBF" w:sz="4"/>
+            </w:tcBorders>
+            <w:tcMar>
+              <w:top w:type="dxa" w:w="80"/>
+              <w:left w:type="dxa" w:w="120"/>
+              <w:bottom w:type="dxa" w:w="80"/>
+              <w:right w:type="dxa" w:w="120"/>
+            </w:tcMar>
+          </w:tcPr>
+          <w:p>
+            <w:r>
+              <w:rPr>
+                <w:rFonts w:ascii="Malgun Gothic" w:cs="Malgun Gothic" w:eastAsia="Malgun Gothic" w:hAnsi="Malgun Gothic"/>
+                <w:b/>
+                <w:bCs/>
+                <w:sz w:val="20"/>
+                <w:szCs w:val="20"/>
+              </w:rPr>
+              <w:t xml:space="preserve">POSTPAY 정산</w:t>
+            </w:r>
+          </w:p>
+        </w:tc>
+        <w:tc>
+          <w:tcPr>
+            <w:tcW w:type="dxa" w:w="2340"/>
+            <w:tcBorders>
+              <w:top w:val="single" w:color="BFBFBF" w:sz="4"/>
+              <w:left w:val="single" w:color="BFBFBF" w:sz="4"/>
+              <w:bottom w:val="single" w:color="BFBFBF" w:sz="4"/>
+              <w:right w:val="single" w:color="BFBFBF" w:sz="4"/>
+            </w:tcBorders>
+            <w:tcMar>
+              <w:top w:type="dxa" w:w="80"/>
+              <w:left w:type="dxa" w:w="120"/>
+              <w:bottom w:type="dxa" w:w="80"/>
+              <w:right w:type="dxa" w:w="120"/>
+            </w:tcMar>
+          </w:tcPr>
+          <w:p>
+            <w:r>
+              <w:rPr>
+                <w:rFonts w:ascii="Malgun Gothic" w:cs="Malgun Gothic" w:eastAsia="Malgun Gothic" w:hAnsi="Malgun Gothic"/>
+                <w:sz w:val="20"/>
+                <w:szCs w:val="20"/>
+              </w:rPr>
+              <w:t xml:space="preserve">송금 (Net-30)</w:t>
+            </w:r>
+          </w:p>
+        </w:tc>
+        <w:tc>
+          <w:tcPr>
+            <w:tcW w:type="dxa" w:w="2340"/>
+            <w:tcBorders>
+              <w:top w:val="single" w:color="BFBFBF" w:sz="4"/>
+              <w:left w:val="single" w:color="BFBFBF" w:sz="4"/>
+              <w:bottom w:val="single" w:color="BFBFBF" w:sz="4"/>
+              <w:right w:val="single" w:color="BFBFBF" w:sz="4"/>
+            </w:tcBorders>
+            <w:tcMar>
+              <w:top w:type="dxa" w:w="80"/>
+              <w:left w:type="dxa" w:w="120"/>
+              <w:bottom w:type="dxa" w:w="80"/>
+              <w:right w:type="dxa" w:w="120"/>
+            </w:tcMar>
+          </w:tcPr>
+          <w:p>
+            <w:r>
+              <w:rPr>
+                <w:rFonts w:ascii="Malgun Gothic" w:cs="Malgun Gothic" w:eastAsia="Malgun Gothic" w:hAnsi="Malgun Gothic"/>
+                <w:sz w:val="20"/>
+                <w:szCs w:val="20"/>
+              </w:rPr>
+              <w:t xml:space="preserve">0%</w:t>
+            </w:r>
+          </w:p>
+        </w:tc>
+        <w:tc>
+          <w:tcPr>
+            <w:tcW w:type="dxa" w:w="2340"/>
+            <w:tcBorders>
+              <w:top w:val="single" w:color="BFBFBF" w:sz="4"/>
+              <w:left w:val="single" w:color="BFBFBF" w:sz="4"/>
+              <w:bottom w:val="single" w:color="BFBFBF" w:sz="4"/>
+              <w:right w:val="single" w:color="BFBFBF" w:sz="4"/>
+            </w:tcBorders>
+            <w:tcMar>
+              <w:top w:type="dxa" w:w="80"/>
+              <w:left w:type="dxa" w:w="120"/>
+              <w:bottom w:type="dxa" w:w="80"/>
+              <w:right w:type="dxa" w:w="120"/>
+            </w:tcMar>
+          </w:tcPr>
+          <w:p>
+            <w:r>
+              <w:rPr>
+                <w:rFonts w:ascii="Malgun Gothic" w:cs="Malgun Gothic" w:eastAsia="Malgun Gothic" w:hAnsi="Malgun Gothic"/>
+                <w:sz w:val="20"/>
+                <w:szCs w:val="20"/>
+              </w:rPr>
+              <w:t xml:space="preserve">—</w:t>
+            </w:r>
+          </w:p>
+        </w:tc>
+      </w:tr>
+      <w:tr>
+        <w:tc>
+          <w:tcPr>
+            <w:tcW w:type="dxa" w:w="2340"/>
+            <w:tcBorders>
+              <w:top w:val="single" w:color="BFBFBF" w:sz="4"/>
+              <w:left w:val="single" w:color="BFBFBF" w:sz="4"/>
+              <w:bottom w:val="single" w:color="BFBFBF" w:sz="4"/>
+              <w:right w:val="single" w:color="BFBFBF" w:sz="4"/>
+            </w:tcBorders>
+            <w:tcMar>
+              <w:top w:type="dxa" w:w="80"/>
+              <w:left w:type="dxa" w:w="120"/>
+              <w:bottom w:type="dxa" w:w="80"/>
+              <w:right w:type="dxa" w:w="120"/>
+            </w:tcMar>
+          </w:tcPr>
+          <w:p>
+            <w:r>
+              <w:rPr>
+                <w:rFonts w:ascii="Malgun Gothic" w:cs="Malgun Gothic" w:eastAsia="Malgun Gothic" w:hAnsi="Malgun Gothic"/>
+                <w:b/>
+                <w:bCs/>
+                <w:sz w:val="20"/>
+                <w:szCs w:val="20"/>
+              </w:rPr>
+              <w:t xml:space="preserve">POSTPAY 카드 협의</w:t>
+            </w:r>
+          </w:p>
+        </w:tc>
+        <w:tc>
+          <w:tcPr>
+            <w:tcW w:type="dxa" w:w="2340"/>
+            <w:tcBorders>
+              <w:top w:val="single" w:color="BFBFBF" w:sz="4"/>
+              <w:left w:val="single" w:color="BFBFBF" w:sz="4"/>
+              <w:bottom w:val="single" w:color="BFBFBF" w:sz="4"/>
+              <w:right w:val="single" w:color="BFBFBF" w:sz="4"/>
+            </w:tcBorders>
+            <w:tcMar>
+              <w:top w:type="dxa" w:w="80"/>
+              <w:left w:type="dxa" w:w="120"/>
+              <w:bottom w:type="dxa" w:w="80"/>
+              <w:right w:type="dxa" w:w="120"/>
+            </w:tcMar>
+          </w:tcPr>
+          <w:p>
+            <w:r>
+              <w:rPr>
+                <w:rFonts w:ascii="Malgun Gothic" w:cs="Malgun Gothic" w:eastAsia="Malgun Gothic" w:hAnsi="Malgun Gothic"/>
+                <w:sz w:val="20"/>
+                <w:szCs w:val="20"/>
+              </w:rPr>
+              <w:t xml:space="preserve">카드</w:t>
+            </w:r>
+          </w:p>
+        </w:tc>
+        <w:tc>
+          <w:tcPr>
+            <w:tcW w:type="dxa" w:w="2340"/>
+            <w:tcBorders>
+              <w:top w:val="single" w:color="BFBFBF" w:sz="4"/>
+              <w:left w:val="single" w:color="BFBFBF" w:sz="4"/>
+              <w:bottom w:val="single" w:color="BFBFBF" w:sz="4"/>
+              <w:right w:val="single" w:color="BFBFBF" w:sz="4"/>
+            </w:tcBorders>
+            <w:tcMar>
+              <w:top w:type="dxa" w:w="80"/>
+              <w:left w:type="dxa" w:w="120"/>
+              <w:bottom w:type="dxa" w:w="80"/>
+              <w:right w:type="dxa" w:w="120"/>
+            </w:tcMar>
+          </w:tcPr>
+          <w:p>
+            <w:r>
+              <w:rPr>
+                <w:rFonts w:ascii="Malgun Gothic" w:cs="Malgun Gothic" w:eastAsia="Malgun Gothic" w:hAnsi="Malgun Gothic"/>
+                <w:sz w:val="20"/>
+                <w:szCs w:val="20"/>
+              </w:rPr>
+              <w:t xml:space="preserve">계약서 별도 명시 (고객 부담)</w:t>
+            </w:r>
+          </w:p>
+        </w:tc>
+        <w:tc>
+          <w:tcPr>
+            <w:tcW w:type="dxa" w:w="2340"/>
+            <w:tcBorders>
+              <w:top w:val="single" w:color="BFBFBF" w:sz="4"/>
+              <w:left w:val="single" w:color="BFBFBF" w:sz="4"/>
+              <w:bottom w:val="single" w:color="BFBFBF" w:sz="4"/>
+              <w:right w:val="single" w:color="BFBFBF" w:sz="4"/>
+            </w:tcBorders>
+            <w:tcMar>
+              <w:top w:type="dxa" w:w="80"/>
+              <w:left w:type="dxa" w:w="120"/>
+              <w:bottom w:type="dxa" w:w="80"/>
+              <w:right w:type="dxa" w:w="120"/>
+            </w:tcMar>
+          </w:tcPr>
+          <w:p>
+            <w:r>
+              <w:rPr>
+                <w:rFonts w:ascii="Malgun Gothic" w:cs="Malgun Gothic" w:eastAsia="Malgun Gothic" w:hAnsi="Malgun Gothic"/>
+                <w:sz w:val="20"/>
+                <w:szCs w:val="20"/>
+              </w:rPr>
+              <w:t xml:space="preserve">TBO</w:t>
+            </w:r>
+          </w:p>
+        </w:tc>
+      </w:tr>
+      <w:tr>
+        <w:tc>
+          <w:tcPr>
+            <w:tcW w:type="dxa" w:w="2340"/>
+            <w:tcBorders>
+              <w:top w:val="single" w:color="BFBFBF" w:sz="4"/>
+              <w:left w:val="single" w:color="BFBFBF" w:sz="4"/>
+              <w:bottom w:val="single" w:color="BFBFBF" w:sz="4"/>
+              <w:right w:val="single" w:color="BFBFBF" w:sz="4"/>
+            </w:tcBorders>
+            <w:tcMar>
+              <w:top w:type="dxa" w:w="80"/>
+              <w:left w:type="dxa" w:w="120"/>
+              <w:bottom w:type="dxa" w:w="80"/>
+              <w:right w:type="dxa" w:w="120"/>
+            </w:tcMar>
+          </w:tcPr>
+          <w:p>
+            <w:r>
+              <w:rPr>
+                <w:rFonts w:ascii="Malgun Gothic" w:cs="Malgun Gothic" w:eastAsia="Malgun Gothic" w:hAnsi="Malgun Gothic"/>
+                <w:b/>
+                <w:bCs/>
+                <w:sz w:val="20"/>
+                <w:szCs w:val="20"/>
+              </w:rPr>
+              <w:t xml:space="preserve">대형 고객사 (TTV 5억+)</w:t>
+            </w:r>
+          </w:p>
+        </w:tc>
+        <w:tc>
+          <w:tcPr>
+            <w:tcW w:type="dxa" w:w="2340"/>
+            <w:tcBorders>
+              <w:top w:val="single" w:color="BFBFBF" w:sz="4"/>
+              <w:left w:val="single" w:color="BFBFBF" w:sz="4"/>
+              <w:bottom w:val="single" w:color="BFBFBF" w:sz="4"/>
+              <w:right w:val="single" w:color="BFBFBF" w:sz="4"/>
+            </w:tcBorders>
+            <w:tcMar>
+              <w:top w:type="dxa" w:w="80"/>
+              <w:left w:type="dxa" w:w="120"/>
+              <w:bottom w:type="dxa" w:w="80"/>
+              <w:right w:type="dxa" w:w="120"/>
+            </w:tcMar>
+          </w:tcPr>
+          <w:p>
+            <w:r>
+              <w:rPr>
+                <w:rFonts w:ascii="Malgun Gothic" w:cs="Malgun Gothic" w:eastAsia="Malgun Gothic" w:hAnsi="Malgun Gothic"/>
+                <w:sz w:val="20"/>
+                <w:szCs w:val="20"/>
+              </w:rPr>
+              <w:t xml:space="preserve">계약 협의</w:t>
+            </w:r>
+          </w:p>
+        </w:tc>
+        <w:tc>
+          <w:tcPr>
+            <w:tcW w:type="dxa" w:w="2340"/>
+            <w:tcBorders>
+              <w:top w:val="single" w:color="BFBFBF" w:sz="4"/>
+              <w:left w:val="single" w:color="BFBFBF" w:sz="4"/>
+              <w:bottom w:val="single" w:color="BFBFBF" w:sz="4"/>
+              <w:right w:val="single" w:color="BFBFBF" w:sz="4"/>
+            </w:tcBorders>
+            <w:tcMar>
+              <w:top w:type="dxa" w:w="80"/>
+              <w:left w:type="dxa" w:w="120"/>
+              <w:bottom w:type="dxa" w:w="80"/>
+              <w:right w:type="dxa" w:w="120"/>
+            </w:tcMar>
+          </w:tcPr>
+          <w:p>
+            <w:r>
+              <w:rPr>
+                <w:rFonts w:ascii="Malgun Gothic" w:cs="Malgun Gothic" w:eastAsia="Malgun Gothic" w:hAnsi="Malgun Gothic"/>
+                <w:sz w:val="20"/>
+                <w:szCs w:val="20"/>
+              </w:rPr>
+              <w:t xml:space="preserve">별도 청구 옵션</w:t>
+            </w:r>
+          </w:p>
+        </w:tc>
+        <w:tc>
+          <w:tcPr>
+            <w:tcW w:type="dxa" w:w="2340"/>
+            <w:tcBorders>
+              <w:top w:val="single" w:color="BFBFBF" w:sz="4"/>
+              <w:left w:val="single" w:color="BFBFBF" w:sz="4"/>
+              <w:bottom w:val="single" w:color="BFBFBF" w:sz="4"/>
+              <w:right w:val="single" w:color="BFBFBF" w:sz="4"/>
+            </w:tcBorders>
+            <w:tcMar>
+              <w:top w:type="dxa" w:w="80"/>
+              <w:left w:type="dxa" w:w="120"/>
+              <w:bottom w:type="dxa" w:w="80"/>
+              <w:right w:type="dxa" w:w="120"/>
+            </w:tcMar>
+          </w:tcPr>
+          <w:p>
+            <w:r>
+              <w:rPr>
+                <w:rFonts w:ascii="Malgun Gothic" w:cs="Malgun Gothic" w:eastAsia="Malgun Gothic" w:hAnsi="Malgun Gothic"/>
+                <w:sz w:val="20"/>
+                <w:szCs w:val="20"/>
+              </w:rPr>
+              <w:t xml:space="preserve">TBO</w:t>
+            </w:r>
+          </w:p>
+        </w:tc>
+      </w:tr>
+    </w:tbl>
+    <w:p>
+      <w:r>
+        <w:t xml:space="preserve"/>
+      </w:r>
+    </w:p>
+    <w:p>
+      <w:r>
+        <w:t xml:space="preserve"/>
+      </w:r>
+    </w:p>
+    <w:p>
+      <w:pPr>
+        <w:pStyle w:val="Heading3"/>
+        <w:spacing w:after="120" w:before="240"/>
+      </w:pPr>
+      <w:r>
+        <w:rPr>
+          <w:rFonts w:ascii="Malgun Gothic" w:cs="Malgun Gothic" w:eastAsia="Malgun Gothic" w:hAnsi="Malgun Gothic"/>
+          <w:b/>
+          <w:bCs/>
+          <w:sz w:val="26"/>
+          <w:szCs w:val="26"/>
+        </w:rPr>
+        <w:t xml:space="preserve">후속 작업 (마켓 리서치 추가 안건)</w:t>
+      </w:r>
+    </w:p>
+    <w:p>
+      <w:r>
+        <w:t xml:space="preserve"/>
+      </w:r>
+    </w:p>
+    <w:p>
+      <w:pPr>
+        <w:pStyle w:val="ListParagraph"/>
+        <w:numPr>
+          <w:ilvl w:val="0"/>
+          <w:numId w:val="2"/>
+        </w:numPr>
+        <w:spacing w:after="60"/>
+      </w:pPr>
+      <w:r>
+        <w:rPr>
+          <w:rFonts w:ascii="Malgun Gothic" w:cs="Malgun Gothic" w:eastAsia="Malgun Gothic" w:hAnsi="Malgun Gothic"/>
+          <w:sz w:val="20"/>
+          <w:szCs w:val="20"/>
+        </w:rPr>
+        <w:t xml:space="preserve">📋 TBO 가격표 상세 (결제수수료 청구 양식) 입수</w:t>
+      </w:r>
+    </w:p>
+    <w:p>
+      <w:pPr>
+        <w:pStyle w:val="ListParagraph"/>
+        <w:numPr>
+          <w:ilvl w:val="0"/>
+          <w:numId w:val="2"/>
+        </w:numPr>
+        <w:spacing w:after="60"/>
+      </w:pPr>
+      <w:r>
+        <w:rPr>
+          <w:rFonts w:ascii="Malgun Gothic" w:cs="Malgun Gothic" w:eastAsia="Malgun Gothic" w:hAnsi="Malgun Gothic"/>
+          <w:sz w:val="20"/>
+          <w:szCs w:val="20"/>
+        </w:rPr>
+        <w:t xml:space="preserve">📋 Ratehawk 호텔 가격 마진 흡수 비율 분석</w:t>
+      </w:r>
+    </w:p>
+    <w:p>
+      <w:pPr>
+        <w:pStyle w:val="ListParagraph"/>
+        <w:numPr>
+          <w:ilvl w:val="0"/>
+          <w:numId w:val="2"/>
+        </w:numPr>
+        <w:spacing w:after="60"/>
+      </w:pPr>
+      <w:r>
+        <w:rPr>
+          <w:rFonts w:ascii="Malgun Gothic" w:cs="Malgun Gothic" w:eastAsia="Malgun Gothic" w:hAnsi="Malgun Gothic"/>
+          <w:sz w:val="20"/>
+          <w:szCs w:val="20"/>
+        </w:rPr>
+        <w:t xml:space="preserve">📋 두 모델 적용 시 고객 수용도 인터뷰 (대형사 5곳)</w:t>
+      </w:r>
+    </w:p>
+    <w:p>
+      <w:pPr>
+        <w:pStyle w:val="ListParagraph"/>
+        <w:numPr>
+          <w:ilvl w:val="0"/>
+          <w:numId w:val="2"/>
+        </w:numPr>
+        <w:spacing w:after="60"/>
+      </w:pPr>
+      <w:r>
+        <w:rPr>
+          <w:rFonts w:ascii="Malgun Gothic" w:cs="Malgun Gothic" w:eastAsia="Malgun Gothic" w:hAnsi="Malgun Gothic"/>
+          <w:sz w:val="20"/>
+          <w:szCs w:val="20"/>
+        </w:rPr>
+        <w:t xml:space="preserve">📋 정량 분석: TBO 방식 시 표시가 절감 % vs 청구 항목 증가 부담</w:t>
       </w:r>
     </w:p>
     <w:p>

</xml_diff>